<commit_message>
feat: Add three-level approval to quotation workflow
- Add approver (principal/VP) field alongside requestor and dept head for formal document signing.

- Implement automatic Chinese date formatting (YYYY-MM-DD → "2026 年 7 月 15 日") for official documents.

- Add support for "other" quotation method explanation.

- Update quotation template, form UI, and API schema to support the complete approval chain.
</commit_message>
<xml_diff>
--- a/public/templates/quotation.docx
+++ b/public/templates/quotation.docx
@@ -1,6 +1,6 @@
 
 <file path=word/document.xml><?xml version="1.0" encoding="utf-8"?>
-<w:document xmlns:wpc="http://schemas.microsoft.com/office/word/2010/wordprocessingCanvas" xmlns:cx="http://schemas.microsoft.com/office/drawing/2014/chartex" xmlns:cx1="http://schemas.microsoft.com/office/drawing/2015/9/8/chartex" xmlns:cx2="http://schemas.microsoft.com/office/drawing/2015/10/21/chartex" xmlns:cx3="http://schemas.microsoft.com/office/drawing/2016/5/9/chartex" xmlns:cx4="http://schemas.microsoft.com/office/drawing/2016/5/10/chartex" xmlns:cx5="http://schemas.microsoft.com/office/drawing/2016/5/11/chartex" xmlns:cx6="http://schemas.microsoft.com/office/drawing/2016/5/12/chartex" xmlns:cx7="http://schemas.microsoft.com/office/drawing/2016/5/13/chartex" xmlns:cx8="http://schemas.microsoft.com/office/drawing/2016/5/14/chartex" xmlns:mc="http://schemas.openxmlformats.org/markup-compatibility/2006" xmlns:aink="http://schemas.microsoft.com/office/drawing/2016/ink" xmlns:am3d="http://schemas.microsoft.com/office/drawing/2017/model3d" xmlns:o="urn:schemas-microsoft-com:office:office" xmlns:oel="http://schemas.microsoft.com/office/2019/extlst" xmlns:r="http://schemas.openxmlformats.org/officeDocument/2006/relationships" xmlns:m="http://schemas.openxmlformats.org/officeDocument/2006/math" xmlns:v="urn:schemas-microsoft-com:vml" xmlns:wp14="http://schemas.microsoft.com/office/word/2010/wordprocessingDrawing" xmlns:wp="http://schemas.openxmlformats.org/drawingml/2006/wordprocessingDrawing" xmlns:w10="urn:schemas-microsoft-com:office:word" xmlns:w="http://schemas.openxmlformats.org/wordprocessingml/2006/main" xmlns:w14="http://schemas.microsoft.com/office/word/2010/wordml" xmlns:w15="http://schemas.microsoft.com/office/word/2012/wordml" xmlns:w16cex="http://schemas.microsoft.com/office/word/2018/wordml/cex" xmlns:w16cid="http://schemas.microsoft.com/office/word/2016/wordml/cid" xmlns:w16="http://schemas.microsoft.com/office/word/2018/wordml" xmlns:w16du="http://schemas.microsoft.com/office/word/2023/wordml/word16du" xmlns:w16sdtdh="http://schemas.microsoft.com/office/word/2020/wordml/sdtdatahash" xmlns:w16sdtfl="http://schemas.microsoft.com/office/word/2024/wordml/sdtformatlock" xmlns:w16se="http://schemas.microsoft.com/office/word/2015/wordml/symex" xmlns:wpg="http://schemas.microsoft.com/office/word/2010/wordprocessingGroup" xmlns:wpi="http://schemas.microsoft.com/office/word/2010/wordprocessingInk" xmlns:wne="http://schemas.microsoft.com/office/word/2006/wordml" xmlns:wps="http://schemas.microsoft.com/office/word/2010/wordprocessingShape" mc:Ignorable="w14 w15 w16se w16cid w16 w16cex w16sdtdh w16sdtfl w16du wp14">
+<w:document xmlns:wpc="http://schemas.microsoft.com/office/word/2010/wordprocessingCanvas" xmlns:cx="http://schemas.microsoft.com/office/drawing/2014/chartex" xmlns:cx1="http://schemas.microsoft.com/office/drawing/2015/9/8/chartex" xmlns:cx2="http://schemas.microsoft.com/office/drawing/2015/10/21/chartex" xmlns:cx3="http://schemas.microsoft.com/office/drawing/2016/5/9/chartex" xmlns:cx4="http://schemas.microsoft.com/office/drawing/2016/5/10/chartex" xmlns:cx5="http://schemas.microsoft.com/office/drawing/2016/5/11/chartex" xmlns:cx6="http://schemas.microsoft.com/office/drawing/2016/5/12/chartex" xmlns:cx7="http://schemas.microsoft.com/office/drawing/2016/5/13/chartex" xmlns:cx8="http://schemas.microsoft.com/office/drawing/2016/5/14/chartex" xmlns:mc="http://schemas.openxmlformats.org/markup-compatibility/2006" xmlns:aink="http://schemas.microsoft.com/office/drawing/2016/ink" xmlns:am3d="http://schemas.microsoft.com/office/drawing/2017/model3d" xmlns:o="urn:schemas-microsoft-com:office:office" xmlns:oel="http://schemas.microsoft.com/office/2019/extlst" xmlns:r="http://schemas.openxmlformats.org/officeDocument/2006/relationships" xmlns:m="http://schemas.openxmlformats.org/officeDocument/2006/math" xmlns:v="urn:schemas-microsoft-com:vml" xmlns:wp14="http://schemas.microsoft.com/office/word/2010/wordprocessingDrawing" xmlns:wp="http://schemas.openxmlformats.org/drawingml/2006/wordprocessingDrawing" xmlns:w10="urn:schemas-microsoft-com:office:word" xmlns:w="http://schemas.openxmlformats.org/wordprocessingml/2006/main" xmlns:w14="http://schemas.microsoft.com/office/word/2010/wordml" xmlns:w15="http://schemas.microsoft.com/office/word/2012/wordml" xmlns:w16cex="http://schemas.microsoft.com/office/word/2018/wordml/cex" xmlns:w16cid="http://schemas.microsoft.com/office/word/2016/wordml/cid" xmlns:w16="http://schemas.microsoft.com/office/word/2018/wordml" xmlns:w16sdtdh="http://schemas.microsoft.com/office/word/2020/wordml/sdtdatahash" xmlns:w16se="http://schemas.microsoft.com/office/word/2015/wordml/symex" xmlns:wpg="http://schemas.microsoft.com/office/word/2010/wordprocessingGroup" xmlns:wpi="http://schemas.microsoft.com/office/word/2010/wordprocessingInk" xmlns:wne="http://schemas.microsoft.com/office/word/2006/wordml" xmlns:wps="http://schemas.microsoft.com/office/word/2010/wordprocessingShape" mc:Ignorable="w14 w15 w16se w16cid w16 w16cex w16sdtdh wp14">
   <w:body>
     <w:p>
       <w:pPr>
@@ -15,6 +15,7 @@
       <w:r>
         <w:rPr>
           <w:noProof/>
+          <w:sz w:val="24"/>
         </w:rPr>
         <mc:AlternateContent>
           <mc:Choice Requires="wpg">
@@ -704,15 +705,15 @@
           </mc:Choice>
           <mc:Fallback>
             <w:pict>
-              <v:group w14:anchorId="33610A31" id="Group 38" o:spid="_x0000_s1026" style="position:absolute;left:0;text-align:left;margin-left:430.15pt;margin-top:6.4pt;width:135.25pt;height:36.85pt;z-index:251673600;mso-position-horizontal-relative:page" coordorigin="8603,128" coordsize="2705,737" o:gfxdata="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">
-                <v:shape id="AutoShape 40" o:spid="_x0000_s1027" style="position:absolute;left:8602;top:128;width:2705;height:737;visibility:visible;mso-wrap-style:square;v-text-anchor:top" coordsize="2705,737" o:gfxdata="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" path="m2702,l2,,,3,,735r2,2l2702,737r3,-2l2705,731,9,731,5,726r4,l9,11r-4,l9,5r2696,l2705,3,2702,xm9,726r-4,l9,731r,-5xm2695,726l9,726r,5l2695,731r,-5xm2695,5r,726l2700,726r5,l2705,11r-5,l2695,5xm2705,726r-5,l2695,731r10,l2705,726xm9,5l5,11r4,l9,5xm2695,5l9,5r,6l2695,11r,-6xm2705,5r-10,l2700,11r5,l2705,5xe" fillcolor="black" stroked="f">
+              <v:group w14:anchorId="33610A31" id="Group 38" o:spid="_x0000_s1026" style="position:absolute;left:0;text-align:left;margin-left:430.15pt;margin-top:6.4pt;width:135.25pt;height:36.85pt;z-index:251673600;mso-position-horizontal-relative:page" coordorigin="8603,128" coordsize="2705,737" o:gfxdata="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">
+                <v:shape id="AutoShape 40" o:spid="_x0000_s1027" style="position:absolute;left:8602;top:128;width:2705;height:737;visibility:visible;mso-wrap-style:square;v-text-anchor:top" coordsize="2705,737" o:gfxdata="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" path="m2702,l2,,,3,,735r2,2l2702,737r3,-2l2705,731,9,731,5,726r4,l9,11r-4,l9,5r2696,l2705,3,2702,xm9,726r-4,l9,731r,-5xm2695,726l9,726r,5l2695,731r,-5xm2695,5r,726l2700,726r5,l2705,11r-5,l2695,5xm2705,726r-5,l2695,731r10,l2705,726xm9,5l5,11r4,l9,5xm2695,5l9,5r,6l2695,11r,-6xm2705,5r-10,l2700,11r5,l2705,5xe" fillcolor="black" stroked="f">
                   <v:path arrowok="t" o:connecttype="custom" o:connectlocs="2702,128;2,128;0,131;0,863;2,865;2702,865;2705,863;2705,859;9,859;5,854;9,854;9,139;5,139;9,133;2705,133;2705,131;2702,128;9,854;5,854;9,859;9,854;2695,854;9,854;9,859;2695,859;2695,854;2695,133;2695,859;2700,854;2705,854;2705,139;2700,139;2695,133;2705,854;2700,854;2695,859;2705,859;2705,854;9,133;5,139;9,139;9,133;2695,133;9,133;9,139;2695,139;2695,133;2705,133;2695,133;2700,139;2705,139;2705,133" o:connectangles="0,0,0,0,0,0,0,0,0,0,0,0,0,0,0,0,0,0,0,0,0,0,0,0,0,0,0,0,0,0,0,0,0,0,0,0,0,0,0,0,0,0,0,0,0,0,0,0,0,0,0,0"/>
                 </v:shape>
                 <v:shapetype id="_x0000_t202" coordsize="21600,21600" o:spt="202" path="m,l,21600r21600,l21600,xe">
                   <v:stroke joinstyle="miter"/>
                   <v:path gradientshapeok="t" o:connecttype="rect"/>
                 </v:shapetype>
-                <v:shape id="Text Box 39" o:spid="_x0000_s1028" type="#_x0000_t202" style="position:absolute;left:8602;top:128;width:2705;height:737;visibility:visible;mso-wrap-style:square;v-text-anchor:top" o:gfxdata="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" filled="f" stroked="f">
+                <v:shape id="Text Box 39" o:spid="_x0000_s1028" type="#_x0000_t202" style="position:absolute;left:8602;top:128;width:2705;height:737;visibility:visible;mso-wrap-style:square;v-text-anchor:top" o:gfxdata="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" filled="f" stroked="f">
                   <v:textbox inset="0,0,0,0">
                     <w:txbxContent>
                       <w:p>
@@ -756,7 +757,7 @@
     </w:p>
     <w:p>
       <w:pPr>
-        <w:pStyle w:val="a3"/>
+        <w:pStyle w:val="BodyText"/>
         <w:spacing w:line="318" w:lineRule="exact"/>
         <w:ind w:left="3267" w:right="3344"/>
         <w:jc w:val="center"/>
@@ -774,6 +775,7 @@
       <w:r>
         <w:rPr>
           <w:noProof/>
+          <w:sz w:val="24"/>
         </w:rPr>
         <mc:AlternateContent>
           <mc:Choice Requires="wps">
@@ -863,7 +865,7 @@
           </mc:Choice>
           <mc:Fallback>
             <w:pict>
-              <v:shape w14:anchorId="60574324" id="Text Box 37" o:spid="_x0000_s1029" type="#_x0000_t202" style="position:absolute;left:0;text-align:left;margin-left:306.55pt;margin-top:.1pt;width:97.7pt;height:13.2pt;z-index:251674624;visibility:visible;mso-wrap-style:square;mso-width-percent:0;mso-height-percent:0;mso-wrap-distance-left:9pt;mso-wrap-distance-top:0;mso-wrap-distance-right:9pt;mso-wrap-distance-bottom:0;mso-position-horizontal:absolute;mso-position-horizontal-relative:page;mso-position-vertical:absolute;mso-position-vertical-relative:text;mso-width-percent:0;mso-height-percent:0;mso-width-relative:page;mso-height-relative:page;v-text-anchor:top" o:gfxdata="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" filled="f" strokeweight=".48pt">
+              <v:shape w14:anchorId="60574324" id="Text Box 37" o:spid="_x0000_s1029" type="#_x0000_t202" style="position:absolute;left:0;text-align:left;margin-left:306.55pt;margin-top:.1pt;width:97.7pt;height:13.2pt;z-index:251674624;visibility:visible;mso-wrap-style:square;mso-width-percent:0;mso-height-percent:0;mso-wrap-distance-left:9pt;mso-wrap-distance-top:0;mso-wrap-distance-right:9pt;mso-wrap-distance-bottom:0;mso-position-horizontal:absolute;mso-position-horizontal-relative:page;mso-position-vertical:absolute;mso-position-vertical-relative:text;mso-width-percent:0;mso-height-percent:0;mso-width-relative:page;mso-height-relative:page;v-text-anchor:top" o:gfxdata="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" filled="f" strokeweight=".48pt">
                 <v:textbox inset="0,0,0,0">
                   <w:txbxContent>
                     <w:p>
@@ -890,6 +892,9 @@
         </mc:AlternateContent>
       </w:r>
       <w:r>
+        <w:rPr>
+          <w:sz w:val="24"/>
+        </w:rPr>
         <w:t>按口頭報價採購表格</w:t>
       </w:r>
     </w:p>
@@ -904,11 +909,15 @@
         </w:rPr>
       </w:pPr>
       <w:r>
+        <w:rPr>
+          <w:sz w:val="24"/>
+        </w:rPr>
         <w:t>本校邀請下列供應商，於</w:t>
       </w:r>
       <w:r>
         <w:rPr>
           <w:b/>
+          <w:sz w:val="24"/>
           <w:u w:val="single"/>
         </w:rPr>
         <w:t>{quotationDate}</w:t>
@@ -921,26 +930,35 @@
         <w:t xml:space="preserve"> </w:t>
       </w:r>
       <w:r>
+        <w:rPr>
+          <w:sz w:val="24"/>
+        </w:rPr>
         <w:t>以</w:t>
       </w:r>
       <w:r>
         <w:rPr>
           <w:spacing w:val="56"/>
+          <w:sz w:val="24"/>
         </w:rPr>
         <w:t xml:space="preserve"> </w:t>
       </w:r>
       <w:r>
         <w:rPr>
           <w:rFonts w:ascii="Wingdings 2" w:eastAsia="Wingdings 2" w:hAnsi="Wingdings 2"/>
+          <w:sz w:val="24"/>
         </w:rPr>
         <w:t>{methodPhoneBox}</w:t>
       </w:r>
       <w:r>
+        <w:rPr>
+          <w:sz w:val="24"/>
+        </w:rPr>
         <w:t>電話</w:t>
       </w:r>
       <w:r>
         <w:rPr>
           <w:spacing w:val="57"/>
+          <w:sz w:val="24"/>
         </w:rPr>
         <w:t xml:space="preserve"> </w:t>
       </w:r>
@@ -948,42 +966,54 @@
       <w:r>
         <w:rPr>
           <w:rFonts w:ascii="Wingdings 2" w:eastAsia="Wingdings 2" w:hAnsi="Wingdings 2"/>
+          <w:sz w:val="24"/>
         </w:rPr>
         <w:t>{methodFaxBox}</w:t>
       </w:r>
       <w:bookmarkEnd w:id="1"/>
       <w:r>
+        <w:rPr>
+          <w:sz w:val="24"/>
+        </w:rPr>
         <w:t>傳真</w:t>
       </w:r>
       <w:r>
         <w:rPr>
           <w:spacing w:val="56"/>
+          <w:sz w:val="24"/>
         </w:rPr>
         <w:t xml:space="preserve"> </w:t>
       </w:r>
       <w:r>
         <w:rPr>
           <w:rFonts w:ascii="Wingdings 2" w:eastAsia="Wingdings 2" w:hAnsi="Wingdings 2"/>
+          <w:sz w:val="24"/>
         </w:rPr>
         <w:t>{methodMailBox}</w:t>
       </w:r>
       <w:r>
+        <w:rPr>
+          <w:sz w:val="24"/>
+        </w:rPr>
         <w:t>專人傳遞</w:t>
       </w:r>
       <w:r>
         <w:rPr>
           <w:spacing w:val="56"/>
+          <w:sz w:val="24"/>
         </w:rPr>
         <w:t xml:space="preserve"> </w:t>
       </w:r>
       <w:r>
         <w:rPr>
           <w:rFonts w:ascii="Wingdings 2" w:eastAsia="Wingdings 2" w:hAnsi="Wingdings 2"/>
+          <w:sz w:val="24"/>
         </w:rPr>
         <w:t>{methodOtherBox}</w:t>
       </w:r>
       <w:r>
         <w:rPr>
+          <w:sz w:val="24"/>
           <w:u w:val="single"/>
         </w:rPr>
         <w:t>其他</w:t>
@@ -992,157 +1022,186 @@
         <w:rPr>
           <w:rFonts w:hint="eastAsia"/>
           <w:b/>
+          <w:sz w:val="24"/>
           <w:u w:val="single"/>
         </w:rPr>
         <w:t>:</w:t>
       </w:r>
       <w:r>
+        <w:t xml:space="preserve"> </w:t>
+      </w:r>
+      <w:r>
+        <w:rPr>
+          <w:b/>
+          <w:sz w:val="24"/>
+          <w:u w:val="single"/>
+        </w:rPr>
+        <w:t>{quoteMethodOther}</w:t>
+      </w:r>
+      <w:r>
+        <w:rPr>
+          <w:sz w:val="24"/>
+        </w:rPr>
+        <w:t>報價方式提供物料或服務的口頭報</w:t>
+      </w:r>
+      <w:r>
+        <w:rPr>
+          <w:spacing w:val="-15"/>
+          <w:sz w:val="24"/>
+        </w:rPr>
+        <w:t>價，</w:t>
+      </w:r>
+      <w:r>
+        <w:rPr>
+          <w:sz w:val="24"/>
+        </w:rPr>
+        <w:t>就供應商所提供的物料或服務的價錢和質素與市場的供應情況作出適當的比較</w:t>
+      </w:r>
+      <w:r>
+        <w:rPr>
+          <w:spacing w:val="-15"/>
+          <w:sz w:val="24"/>
+        </w:rPr>
+        <w:t>後，</w:t>
+      </w:r>
+      <w:r>
+        <w:rPr>
+          <w:sz w:val="24"/>
+        </w:rPr>
+        <w:t>現推薦採納由</w:t>
+      </w:r>
+      <w:r>
         <w:rPr>
           <w:rFonts w:hint="eastAsia"/>
+          <w:sz w:val="24"/>
+        </w:rPr>
+        <w:t xml:space="preserve"> </w:t>
+      </w:r>
+      <w:r>
+        <w:rPr>
+          <w:sz w:val="24"/>
+        </w:rPr>
+        <w:t xml:space="preserve"> </w:t>
+      </w:r>
+      <w:r>
+        <w:rPr>
+          <w:rFonts w:ascii="Times New Roman" w:hAnsi="Times New Roman" w:cs="Times New Roman"/>
+          <w:sz w:val="24"/>
+        </w:rPr>
+        <w:t xml:space="preserve">  </w:t>
+      </w:r>
+      <w:r>
+        <w:rPr>
+          <w:rFonts w:ascii="Times New Roman" w:hAnsi="Times New Roman" w:cs="Times New Roman" w:hint="eastAsia"/>
+          <w:sz w:val="24"/>
+        </w:rPr>
+        <w:t>{recommendedSupplier}</w:t>
+      </w:r>
+      <w:r>
+        <w:rPr>
+          <w:rFonts w:ascii="Times New Roman" w:hAnsi="Times New Roman" w:cs="Times New Roman"/>
+          <w:sz w:val="24"/>
+          <w:u w:val="single"/>
+        </w:rPr>
+        <w:t xml:space="preserve">      </w:t>
+      </w:r>
+      <w:r>
+        <w:rPr>
+          <w:sz w:val="24"/>
+          <w:u w:val="single"/>
+        </w:rPr>
+        <w:t xml:space="preserve"> </w:t>
+      </w:r>
+      <w:r>
+        <w:rPr>
+          <w:sz w:val="24"/>
+        </w:rPr>
+        <w:t xml:space="preserve">    </w:t>
+      </w:r>
+      <w:r>
+        <w:rPr>
+          <w:sz w:val="24"/>
+        </w:rPr>
+        <w:t>提出的</w:t>
+      </w:r>
+      <w:r>
+        <w:rPr>
+          <w:spacing w:val="50"/>
+          <w:sz w:val="24"/>
+        </w:rPr>
+        <w:t xml:space="preserve"> </w:t>
+      </w:r>
+      <w:r>
+        <w:rPr>
+          <w:rFonts w:ascii="Wingdings 2" w:eastAsia="Wingdings 2" w:hAnsi="Wingdings 2"/>
+          <w:sz w:val="24"/>
+        </w:rPr>
+        <w:t>{priceLowerBox}</w:t>
+      </w:r>
+      <w:r>
+        <w:rPr>
+          <w:sz w:val="24"/>
+        </w:rPr>
+        <w:t>較低報價</w:t>
+      </w:r>
+      <w:r>
+        <w:rPr>
+          <w:spacing w:val="49"/>
+          <w:sz w:val="24"/>
+        </w:rPr>
+        <w:t xml:space="preserve"> </w:t>
+      </w:r>
+      <w:r>
+        <w:rPr>
+          <w:sz w:val="24"/>
+        </w:rPr>
+        <w:t>(*</w:t>
+      </w:r>
+      <w:r>
+        <w:rPr>
+          <w:rFonts w:ascii="Wingdings 2" w:eastAsia="Wingdings 2" w:hAnsi="Wingdings 2"/>
+          <w:sz w:val="24"/>
+        </w:rPr>
+        <w:t>{priceHigherBox}</w:t>
+      </w:r>
+      <w:r>
+        <w:rPr>
+          <w:sz w:val="24"/>
+        </w:rPr>
+        <w:t>較高報</w:t>
+      </w:r>
+      <w:r>
+        <w:rPr>
+          <w:spacing w:val="-16"/>
+          <w:sz w:val="24"/>
+        </w:rPr>
+        <w:t>價</w:t>
+      </w:r>
+      <w:r>
+        <w:rPr>
+          <w:sz w:val="24"/>
+        </w:rPr>
+        <w:t>不採納最低報價的原因是：</w:t>
+      </w:r>
+      <w:r>
+        <w:rPr>
           <w:b/>
+          <w:sz w:val="24"/>
           <w:u w:val="single"/>
         </w:rPr>
-        <w:t xml:space="preserve"> </w:t>
+        <w:t>{higherPriceReason}</w:t>
       </w:r>
       <w:r>
         <w:rPr>
           <w:b/>
-          <w:u w:val="single"/>
-        </w:rPr>
-        <w:t xml:space="preserve">    </w:t>
-      </w:r>
-      <w:r>
-        <w:t>報價方式提供物料或服務的口頭報</w:t>
-      </w:r>
-      <w:r>
-        <w:rPr>
-          <w:spacing w:val="-15"/>
-        </w:rPr>
-        <w:t>價，</w:t>
-      </w:r>
-      <w:r>
-        <w:t>就供應商所提供的物料或服務的價錢和質素與市場的供應情況作出適當的比較</w:t>
-      </w:r>
-      <w:r>
-        <w:rPr>
-          <w:spacing w:val="-15"/>
-        </w:rPr>
-        <w:t>後，</w:t>
-      </w:r>
-      <w:r>
-        <w:t>現推薦採納由</w:t>
-      </w:r>
-      <w:r>
-        <w:rPr>
-          <w:rFonts w:hint="eastAsia"/>
-        </w:rPr>
-        <w:t xml:space="preserve"> </w:t>
-      </w:r>
-      <w:r>
-        <w:t xml:space="preserve"> </w:t>
-      </w:r>
-      <w:r>
-        <w:rPr>
-          <w:rFonts w:ascii="Times New Roman" w:hAnsi="Times New Roman" w:cs="Times New Roman"/>
-        </w:rPr>
-        <w:t xml:space="preserve">  </w:t>
-      </w:r>
-      <w:r>
-        <w:rPr>
-          <w:rFonts w:ascii="Times New Roman" w:hAnsi="Times New Roman" w:cs="Times New Roman" w:hint="eastAsia"/>
-        </w:rPr>
-        <w:t>{recommendedSupplier}</w:t>
-      </w:r>
-      <w:r>
-        <w:rPr>
-          <w:rFonts w:ascii="Times New Roman" w:hAnsi="Times New Roman" w:cs="Times New Roman"/>
-          <w:u w:val="single"/>
-        </w:rPr>
-      </w:r>
-      <w:r>
-        <w:rPr>
-          <w:rFonts w:ascii="Times New Roman" w:hAnsi="Times New Roman" w:cs="Times New Roman" w:hint="eastAsia"/>
-          <w:u w:val="single"/>
-        </w:rPr>
-      </w:r>
-      <w:r>
-        <w:rPr>
-          <w:rFonts w:ascii="Times New Roman" w:hAnsi="Times New Roman" w:cs="Times New Roman"/>
-          <w:u w:val="single"/>
-        </w:rPr>
-        <w:t xml:space="preserve">      </w:t>
-      </w:r>
-      <w:r>
-        <w:rPr>
-          <w:u w:val="single"/>
-        </w:rPr>
-        <w:t xml:space="preserve"> </w:t>
-      </w:r>
-      <w:r>
-        <w:t xml:space="preserve">    </w:t>
-      </w:r>
-      <w:r>
-        <w:t>提出的</w:t>
-      </w:r>
-      <w:r>
-        <w:rPr>
-          <w:spacing w:val="50"/>
-        </w:rPr>
-        <w:t xml:space="preserve"> </w:t>
-      </w:r>
-      <w:r>
-        <w:rPr>
-          <w:rFonts w:ascii="Wingdings 2" w:eastAsia="Wingdings 2" w:hAnsi="Wingdings 2"/>
-        </w:rPr>
-        <w:t>{priceLowerBox}</w:t>
-      </w:r>
-      <w:r>
-        <w:t>較低報價</w:t>
-      </w:r>
-      <w:r>
-        <w:rPr>
-          <w:spacing w:val="49"/>
-        </w:rPr>
-        <w:t xml:space="preserve"> </w:t>
-      </w:r>
-      <w:r>
-        <w:t>(*</w:t>
-      </w:r>
-      <w:r>
-        <w:rPr>
-          <w:rFonts w:ascii="Wingdings 2" w:eastAsia="Wingdings 2" w:hAnsi="Wingdings 2"/>
-        </w:rPr>
-        <w:t>{priceHigherBox}</w:t>
-      </w:r>
-      <w:r>
-        <w:t>較高報</w:t>
-      </w:r>
-      <w:r>
-        <w:rPr>
-          <w:spacing w:val="-16"/>
-        </w:rPr>
-        <w:t>價</w:t>
-      </w:r>
-      <w:r>
-        <w:t>不採納最低報價的原因是：</w:t>
-      </w:r>
-      <w:r>
-        <w:rPr>
-          <w:b/>
-          <w:u w:val="single"/>
-        </w:rPr>
-        <w:t>{higherPriceReason}</w:t>
-      </w:r>
-      <w:r>
-        <w:rPr>
-          <w:b/>
+          <w:sz w:val="24"/>
         </w:rPr>
         <w:t>)</w:t>
       </w:r>
     </w:p>
     <w:p>
       <w:pPr>
-        <w:pStyle w:val="a3"/>
+        <w:pStyle w:val="BodyText"/>
         <w:spacing w:before="1"/>
         <w:rPr>
           <w:sz w:val="7"/>
@@ -1151,7 +1210,7 @@
     </w:p>
     <w:tbl>
       <w:tblPr>
-        <w:tblStyle w:val="TableNormal"/>
+        <w:tblStyle w:val="TableNormal1"/>
         <w:tblW w:w="0" w:type="auto"/>
         <w:tblInd w:w="131" w:type="dxa"/>
         <w:tblBorders>
@@ -1442,12 +1501,28 @@
                 <w:rFonts w:ascii="Times New Roman" w:hint="eastAsia"/>
                 <w:lang w:val="en-US"/>
               </w:rPr>
-              <w:t>{quotationName}</w:t>
+              <w:t>{</w:t>
+            </w:r>
+            <w:proofErr w:type="spellStart"/>
+            <w:r>
+              <w:rPr>
+                <w:rFonts w:ascii="Times New Roman" w:hint="eastAsia"/>
+                <w:lang w:val="en-US"/>
+              </w:rPr>
+              <w:t>quotationName</w:t>
+            </w:r>
+            <w:proofErr w:type="spellEnd"/>
+            <w:r>
+              <w:rPr>
+                <w:rFonts w:ascii="Times New Roman" w:hint="eastAsia"/>
+                <w:lang w:val="en-US"/>
+              </w:rPr>
+              <w:t>}</w:t>
             </w:r>
           </w:p>
           <w:p>
             <w:pPr>
-              <w:pStyle w:val="a4"/>
+              <w:pStyle w:val="ListParagraph"/>
               <w:numPr>
                 <w:ilvl w:val="0"/>
                 <w:numId w:val="5"/>
@@ -1467,16 +1542,10 @@
               </w:rPr>
               <w:t>{item1Name}</w:t>
             </w:r>
-            <w:r>
-              <w:rPr>
-                <w:rFonts w:ascii="Times New Roman" w:hint="eastAsia"/>
-                <w:lang w:val="en-US"/>
-              </w:rPr>
-            </w:r>
           </w:p>
           <w:p>
             <w:pPr>
-              <w:pStyle w:val="a4"/>
+              <w:pStyle w:val="ListParagraph"/>
               <w:numPr>
                 <w:ilvl w:val="0"/>
                 <w:numId w:val="5"/>
@@ -1496,16 +1565,10 @@
               </w:rPr>
               <w:t>{item2Name}</w:t>
             </w:r>
-            <w:r>
-              <w:rPr>
-                <w:rFonts w:ascii="Times New Roman" w:hint="eastAsia"/>
-                <w:lang w:val="en-US"/>
-              </w:rPr>
-            </w:r>
           </w:p>
           <w:p>
             <w:pPr>
-              <w:pStyle w:val="a4"/>
+              <w:pStyle w:val="ListParagraph"/>
               <w:numPr>
                 <w:ilvl w:val="0"/>
                 <w:numId w:val="5"/>
@@ -1524,12 +1587,6 @@
                 <w:lang w:val="en-US"/>
               </w:rPr>
               <w:t>{item3Name}</w:t>
-            </w:r>
-            <w:r>
-              <w:rPr>
-                <w:rFonts w:ascii="Times New Roman" w:hint="eastAsia"/>
-                <w:lang w:val="en-US"/>
-              </w:rPr>
             </w:r>
           </w:p>
         </w:tc>
@@ -1564,17 +1621,23 @@
               </w:rPr>
               <w:t>{item1Qty}</w:t>
             </w:r>
+          </w:p>
+          <w:p>
+            <w:pPr>
+              <w:snapToGrid w:val="0"/>
+              <w:spacing w:line="0" w:lineRule="atLeast"/>
+              <w:jc w:val="center"/>
+              <w:rPr>
+                <w:rFonts w:ascii="Times New Roman"/>
+                <w:lang w:val="en-US"/>
+              </w:rPr>
+            </w:pPr>
             <w:r>
               <w:rPr>
                 <w:rFonts w:ascii="Times New Roman" w:hint="eastAsia"/>
                 <w:lang w:val="en-US"/>
               </w:rPr>
-            </w:r>
-            <w:r>
-              <w:rPr>
-                <w:rFonts w:ascii="Times New Roman" w:hint="eastAsia"/>
-                <w:lang w:val="en-US"/>
-              </w:rPr>
+              <w:t>{item2Qty}</w:t>
             </w:r>
           </w:p>
           <w:p>
@@ -1592,49 +1655,7 @@
                 <w:rFonts w:ascii="Times New Roman" w:hint="eastAsia"/>
                 <w:lang w:val="en-US"/>
               </w:rPr>
-              <w:t>{item2Qty}</w:t>
-            </w:r>
-            <w:r>
-              <w:rPr>
-                <w:rFonts w:ascii="Times New Roman" w:hint="eastAsia"/>
-                <w:lang w:val="en-US"/>
-              </w:rPr>
-            </w:r>
-            <w:r>
-              <w:rPr>
-                <w:rFonts w:ascii="Times New Roman" w:hint="eastAsia"/>
-                <w:lang w:val="en-US"/>
-              </w:rPr>
-            </w:r>
-          </w:p>
-          <w:p>
-            <w:pPr>
-              <w:snapToGrid w:val="0"/>
-              <w:spacing w:line="0" w:lineRule="atLeast"/>
-              <w:jc w:val="center"/>
-              <w:rPr>
-                <w:rFonts w:ascii="Times New Roman"/>
-                <w:lang w:val="en-US"/>
-              </w:rPr>
-            </w:pPr>
-            <w:r>
-              <w:rPr>
-                <w:rFonts w:ascii="Times New Roman" w:hint="eastAsia"/>
-                <w:lang w:val="en-US"/>
-              </w:rPr>
               <w:t>{item3Qty}</w:t>
-            </w:r>
-            <w:r>
-              <w:rPr>
-                <w:rFonts w:ascii="Times New Roman" w:hint="eastAsia"/>
-                <w:lang w:val="en-US"/>
-              </w:rPr>
-            </w:r>
-            <w:r>
-              <w:rPr>
-                <w:rFonts w:ascii="Times New Roman" w:hint="eastAsia"/>
-                <w:lang w:val="en-US"/>
-              </w:rPr>
             </w:r>
           </w:p>
           <w:p>
@@ -1669,13 +1690,23 @@
                 <w:rFonts w:ascii="Times New Roman"/>
                 <w:lang w:val="en-US"/>
               </w:rPr>
-              <w:t>{supAName}</w:t>
+              <w:t>{</w:t>
             </w:r>
+            <w:proofErr w:type="spellStart"/>
             <w:r>
               <w:rPr>
-                <w:rFonts w:ascii="Times New Roman" w:hint="eastAsia"/>
+                <w:rFonts w:ascii="Times New Roman"/>
                 <w:lang w:val="en-US"/>
               </w:rPr>
+              <w:t>supAName</w:t>
+            </w:r>
+            <w:proofErr w:type="spellEnd"/>
+            <w:r>
+              <w:rPr>
+                <w:rFonts w:ascii="Times New Roman"/>
+                <w:lang w:val="en-US"/>
+              </w:rPr>
+              <w:t>}</w:t>
             </w:r>
           </w:p>
           <w:p>
@@ -1693,19 +1724,23 @@
                 <w:rFonts w:ascii="Times New Roman" w:hint="eastAsia"/>
                 <w:lang w:val="en-US"/>
               </w:rPr>
-              <w:t>{supATel}</w:t>
+              <w:t>{</w:t>
             </w:r>
-            <w:r>
-              <w:rPr>
-                <w:rFonts w:ascii="Times New Roman"/>
-                <w:lang w:val="en-US"/>
-              </w:rPr>
-            </w:r>
+            <w:proofErr w:type="spellStart"/>
             <w:r>
               <w:rPr>
                 <w:rFonts w:ascii="Times New Roman" w:hint="eastAsia"/>
                 <w:lang w:val="en-US"/>
               </w:rPr>
+              <w:t>supATel</w:t>
+            </w:r>
+            <w:proofErr w:type="spellEnd"/>
+            <w:r>
+              <w:rPr>
+                <w:rFonts w:ascii="Times New Roman" w:hint="eastAsia"/>
+                <w:lang w:val="en-US"/>
+              </w:rPr>
+              <w:t>}</w:t>
             </w:r>
           </w:p>
           <w:p>
@@ -1742,19 +1777,23 @@
                 <w:rFonts w:ascii="Times New Roman" w:hint="eastAsia"/>
                 <w:lang w:val="en-US"/>
               </w:rPr>
-              <w:t>{supAPrices}</w:t>
+              <w:t>{</w:t>
             </w:r>
-            <w:r>
-              <w:rPr>
-                <w:rFonts w:ascii="Times New Roman"/>
-                <w:lang w:val="en-US"/>
-              </w:rPr>
-            </w:r>
+            <w:proofErr w:type="spellStart"/>
             <w:r>
               <w:rPr>
                 <w:rFonts w:ascii="Times New Roman" w:hint="eastAsia"/>
                 <w:lang w:val="en-US"/>
               </w:rPr>
+              <w:t>supAPrices</w:t>
+            </w:r>
+            <w:proofErr w:type="spellEnd"/>
+            <w:r>
+              <w:rPr>
+                <w:rFonts w:ascii="Times New Roman" w:hint="eastAsia"/>
+                <w:lang w:val="en-US"/>
+              </w:rPr>
+              <w:t>}</w:t>
             </w:r>
           </w:p>
           <w:p>
@@ -1791,19 +1830,23 @@
                 <w:rFonts w:ascii="Times New Roman" w:hint="eastAsia"/>
                 <w:lang w:val="en-US"/>
               </w:rPr>
-              <w:t>{supATotal}</w:t>
+              <w:t>{</w:t>
             </w:r>
-            <w:r>
-              <w:rPr>
-                <w:rFonts w:ascii="Times New Roman"/>
-                <w:lang w:val="en-US"/>
-              </w:rPr>
-            </w:r>
+            <w:proofErr w:type="spellStart"/>
             <w:r>
               <w:rPr>
                 <w:rFonts w:ascii="Times New Roman" w:hint="eastAsia"/>
                 <w:lang w:val="en-US"/>
               </w:rPr>
+              <w:t>supATotal</w:t>
+            </w:r>
+            <w:proofErr w:type="spellEnd"/>
+            <w:r>
+              <w:rPr>
+                <w:rFonts w:ascii="Times New Roman" w:hint="eastAsia"/>
+                <w:lang w:val="en-US"/>
+              </w:rPr>
+              <w:t>}</w:t>
             </w:r>
           </w:p>
           <w:p>
@@ -1912,13 +1955,23 @@
                 <w:rFonts w:ascii="Times New Roman"/>
                 <w:lang w:val="en-US"/>
               </w:rPr>
-              <w:t>{supBName}</w:t>
+              <w:t>{</w:t>
             </w:r>
+            <w:proofErr w:type="spellStart"/>
             <w:r>
               <w:rPr>
-                <w:rFonts w:ascii="Times New Roman" w:hint="eastAsia"/>
+                <w:rFonts w:ascii="Times New Roman"/>
                 <w:lang w:val="en-US"/>
               </w:rPr>
+              <w:t>supBName</w:t>
+            </w:r>
+            <w:proofErr w:type="spellEnd"/>
+            <w:r>
+              <w:rPr>
+                <w:rFonts w:ascii="Times New Roman"/>
+                <w:lang w:val="en-US"/>
+              </w:rPr>
+              <w:t>}</w:t>
             </w:r>
           </w:p>
           <w:p>
@@ -1936,19 +1989,23 @@
                 <w:rFonts w:ascii="Times New Roman" w:hint="eastAsia"/>
                 <w:lang w:val="en-US"/>
               </w:rPr>
-              <w:t>{supBTel}</w:t>
+              <w:t>{</w:t>
             </w:r>
-            <w:r>
-              <w:rPr>
-                <w:rFonts w:ascii="Times New Roman"/>
-                <w:lang w:val="en-US"/>
-              </w:rPr>
-            </w:r>
+            <w:proofErr w:type="spellStart"/>
             <w:r>
               <w:rPr>
                 <w:rFonts w:ascii="Times New Roman" w:hint="eastAsia"/>
                 <w:lang w:val="en-US"/>
               </w:rPr>
+              <w:t>supBTel</w:t>
+            </w:r>
+            <w:proofErr w:type="spellEnd"/>
+            <w:r>
+              <w:rPr>
+                <w:rFonts w:ascii="Times New Roman" w:hint="eastAsia"/>
+                <w:lang w:val="en-US"/>
+              </w:rPr>
+              <w:t>}</w:t>
             </w:r>
           </w:p>
           <w:p>
@@ -1985,19 +2042,23 @@
                 <w:rFonts w:ascii="Times New Roman" w:hint="eastAsia"/>
                 <w:lang w:val="en-US"/>
               </w:rPr>
-              <w:t>{supBPrices}</w:t>
+              <w:t>{</w:t>
             </w:r>
-            <w:r>
-              <w:rPr>
-                <w:rFonts w:ascii="Times New Roman"/>
-                <w:lang w:val="en-US"/>
-              </w:rPr>
-            </w:r>
+            <w:proofErr w:type="spellStart"/>
             <w:r>
               <w:rPr>
                 <w:rFonts w:ascii="Times New Roman" w:hint="eastAsia"/>
                 <w:lang w:val="en-US"/>
               </w:rPr>
+              <w:t>supBPrices</w:t>
+            </w:r>
+            <w:proofErr w:type="spellEnd"/>
+            <w:r>
+              <w:rPr>
+                <w:rFonts w:ascii="Times New Roman" w:hint="eastAsia"/>
+                <w:lang w:val="en-US"/>
+              </w:rPr>
+              <w:t>}</w:t>
             </w:r>
           </w:p>
           <w:p>
@@ -2033,19 +2094,23 @@
                 <w:rFonts w:ascii="Times New Roman" w:hint="eastAsia"/>
                 <w:lang w:val="en-US"/>
               </w:rPr>
-              <w:t>{supBTotal}</w:t>
+              <w:t>{</w:t>
             </w:r>
-            <w:r>
-              <w:rPr>
-                <w:rFonts w:ascii="Times New Roman"/>
-                <w:lang w:val="en-US"/>
-              </w:rPr>
-            </w:r>
+            <w:proofErr w:type="spellStart"/>
             <w:r>
               <w:rPr>
                 <w:rFonts w:ascii="Times New Roman" w:hint="eastAsia"/>
                 <w:lang w:val="en-US"/>
               </w:rPr>
+              <w:t>supBTotal</w:t>
+            </w:r>
+            <w:proofErr w:type="spellEnd"/>
+            <w:r>
+              <w:rPr>
+                <w:rFonts w:ascii="Times New Roman" w:hint="eastAsia"/>
+                <w:lang w:val="en-US"/>
+              </w:rPr>
+              <w:t>}</w:t>
             </w:r>
           </w:p>
           <w:p>
@@ -2079,13 +2144,23 @@
                 <w:rFonts w:ascii="Times New Roman" w:hint="eastAsia"/>
                 <w:lang w:val="en-GB"/>
               </w:rPr>
-              <w:t>{supBAdopt}</w:t>
+              <w:t>{</w:t>
             </w:r>
+            <w:proofErr w:type="spellStart"/>
             <w:r>
               <w:rPr>
-                <w:rFonts w:ascii="Times New Roman"/>
+                <w:rFonts w:ascii="Times New Roman" w:hint="eastAsia"/>
                 <w:lang w:val="en-GB"/>
               </w:rPr>
+              <w:t>supBAdopt</w:t>
+            </w:r>
+            <w:proofErr w:type="spellEnd"/>
+            <w:r>
+              <w:rPr>
+                <w:rFonts w:ascii="Times New Roman" w:hint="eastAsia"/>
+                <w:lang w:val="en-GB"/>
+              </w:rPr>
+              <w:t>}</w:t>
             </w:r>
           </w:p>
         </w:tc>
@@ -2209,18 +2284,6 @@
                 <w:lang w:val="en-GB"/>
               </w:rPr>
             </w:pPr>
-            <w:r>
-              <w:rPr>
-                <w:rFonts w:ascii="Times New Roman" w:hint="eastAsia"/>
-                <w:lang w:val="en-GB"/>
-              </w:rPr>
-            </w:r>
-            <w:r>
-              <w:rPr>
-                <w:rFonts w:ascii="Times New Roman"/>
-                <w:lang w:val="en-GB"/>
-              </w:rPr>
-            </w:r>
           </w:p>
         </w:tc>
       </w:tr>
@@ -2283,13 +2346,6 @@
       </w:r>
       <w:r>
         <w:rPr>
-          <w:sz w:val="18"/>
-          <w:szCs w:val="16"/>
-          <w:u w:val="single"/>
-        </w:rPr>
-      </w:r>
-      <w:r>
-        <w:rPr>
           <w:spacing w:val="2"/>
           <w:sz w:val="24"/>
         </w:rPr>
@@ -2375,6 +2431,7 @@
       <w:r>
         <w:rPr>
           <w:rFonts w:ascii="Wingdings 2" w:eastAsia="Wingdings 2" w:hAnsi="Wingdings 2"/>
+          <w:sz w:val="24"/>
         </w:rPr>
         <w:t>{catConsumableBox}</w:t>
       </w:r>
@@ -2394,6 +2451,7 @@
       <w:r>
         <w:rPr>
           <w:rFonts w:ascii="Wingdings 2" w:eastAsia="Wingdings 2" w:hAnsi="Wingdings 2"/>
+          <w:sz w:val="24"/>
         </w:rPr>
         <w:t>{catOtherBox}</w:t>
       </w:r>
@@ -2421,30 +2479,38 @@
       </w:r>
       <w:r>
         <w:rPr>
+          <w:sz w:val="24"/>
+        </w:rPr>
+        <w:t>，供應</w:t>
+      </w:r>
+      <w:r>
+        <w:rPr>
+          <w:sz w:val="24"/>
+          <w:u w:val="single"/>
+        </w:rPr>
+        <w:t xml:space="preserve">   </w:t>
+      </w:r>
+      <w:r>
+        <w:rPr>
+          <w:rFonts w:hint="eastAsia"/>
           <w:sz w:val="20"/>
           <w:szCs w:val="18"/>
           <w:u w:val="single"/>
         </w:rPr>
-      </w:r>
-      <w:r>
-        <w:rPr>
-          <w:rFonts w:hint="eastAsia"/>
-          <w:sz w:val="24"/>
+        <w:t>{department}</w:t>
+      </w:r>
+      <w:r>
+        <w:rPr>
+          <w:sz w:val="18"/>
+        </w:rPr>
+        <w:t>(所屬科/組)</w:t>
+      </w:r>
+      <w:r>
+        <w:rPr>
+          <w:sz w:val="18"/>
           <w:u w:val="single"/>
         </w:rPr>
-      </w:r>
-      <w:r>
-        <w:rPr>
-          <w:sz w:val="24"/>
-        </w:rPr>
-        <w:t>，供應</w:t>
-      </w:r>
-      <w:r>
-        <w:rPr>
-          <w:sz w:val="24"/>
-          <w:u w:val="single"/>
-        </w:rPr>
-        <w:t xml:space="preserve">   </w:t>
+        <w:t xml:space="preserve">    </w:t>
       </w:r>
       <w:r>
         <w:rPr>
@@ -2453,56 +2519,7 @@
           <w:szCs w:val="18"/>
           <w:u w:val="single"/>
         </w:rPr>
-        <w:t>{department}</w:t>
-      </w:r>
-      <w:r>
-        <w:rPr>
-          <w:sz w:val="20"/>
-          <w:szCs w:val="18"/>
-          <w:u w:val="single"/>
-        </w:rPr>
-      </w:r>
-      <w:r>
-        <w:rPr>
-          <w:sz w:val="24"/>
-          <w:u w:val="single"/>
-        </w:rPr>
-      </w:r>
-      <w:r>
-        <w:rPr>
-          <w:sz w:val="18"/>
-        </w:rPr>
-        <w:t>(所屬科/組)</w:t>
-      </w:r>
-      <w:r>
-        <w:rPr>
-          <w:sz w:val="18"/>
-          <w:u w:val="single"/>
-        </w:rPr>
-        <w:t xml:space="preserve">    </w:t>
-      </w:r>
-      <w:r>
-        <w:rPr>
-          <w:rFonts w:hint="eastAsia"/>
-          <w:sz w:val="20"/>
-          <w:szCs w:val="18"/>
-          <w:u w:val="single"/>
-        </w:rPr>
         <w:t>{purpose}</w:t>
-      </w:r>
-      <w:r>
-        <w:rPr>
-          <w:sz w:val="20"/>
-          <w:szCs w:val="18"/>
-          <w:u w:val="single"/>
-        </w:rPr>
-      </w:r>
-      <w:r>
-        <w:rPr>
-          <w:rFonts w:hint="eastAsia"/>
-          <w:sz w:val="18"/>
-          <w:u w:val="single"/>
-        </w:rPr>
       </w:r>
       <w:r>
         <w:rPr>
@@ -2641,12 +2658,6 @@
           <w:sz w:val="24"/>
           <w:u w:val="single"/>
         </w:rPr>
-      </w:r>
-      <w:r>
-        <w:rPr>
-          <w:sz w:val="24"/>
-          <w:u w:val="single"/>
-        </w:rPr>
         <w:tab/>
       </w:r>
       <w:r>
@@ -2691,7 +2702,7 @@
     </w:p>
     <w:p>
       <w:pPr>
-        <w:pStyle w:val="a3"/>
+        <w:pStyle w:val="BodyText"/>
         <w:spacing w:before="85"/>
         <w:ind w:left="124"/>
       </w:pPr>
@@ -2701,7 +2712,7 @@
     </w:p>
     <w:p>
       <w:pPr>
-        <w:pStyle w:val="a3"/>
+        <w:pStyle w:val="BodyText"/>
         <w:spacing w:before="173" w:line="223" w:lineRule="auto"/>
         <w:ind w:left="124" w:right="308"/>
         <w:jc w:val="both"/>
@@ -2748,7 +2759,7 @@
     </w:p>
     <w:p>
       <w:pPr>
-        <w:pStyle w:val="a3"/>
+        <w:pStyle w:val="BodyText"/>
         <w:tabs>
           <w:tab w:val="left" w:pos="11073"/>
         </w:tabs>
@@ -2791,227 +2802,55 @@
       <w:r>
         <w:rPr>
           <w:b/>
-          <w:spacing w:val="-4"/>
-          <w:sz w:val="24"/>
-        </w:rPr>
-        <w:t>索取報價</w:t>
+          <w:sz w:val="24"/>
+        </w:rPr>
+        <w:t xml:space="preserve">索取報價人 姓名: </w:t>
+      </w:r>
+      <w:r>
+        <w:rPr>
+          <w:sz w:val="24"/>
+        </w:rPr>
+        <w:t>{requestorName}</w:t>
       </w:r>
       <w:r>
         <w:rPr>
           <w:b/>
           <w:sz w:val="24"/>
         </w:rPr>
-        <w:t>人</w:t>
+        <w:tab/>
+        <w:t xml:space="preserve">職級: </w:t>
+      </w:r>
+      <w:r>
+        <w:rPr>
+          <w:sz w:val="24"/>
+        </w:rPr>
+        <w:t>{requestorRank}</w:t>
       </w:r>
       <w:r>
         <w:rPr>
           <w:b/>
-          <w:spacing w:val="49"/>
-          <w:sz w:val="24"/>
-        </w:rPr>
-        <w:t xml:space="preserve"> </w:t>
-      </w:r>
-      <w:r>
-        <w:rPr>
-          <w:sz w:val="24"/>
-        </w:rPr>
-        <w:t>姓名</w:t>
-      </w:r>
-      <w:r>
-        <w:rPr>
-          <w:rFonts w:hint="eastAsia"/>
-          <w:sz w:val="24"/>
-        </w:rPr>
-        <w:t xml:space="preserve"> </w:t>
-      </w:r>
-      <w:r>
-        <w:rPr>
-          <w:sz w:val="24"/>
-        </w:rPr>
-        <w:t xml:space="preserve">  </w:t>
-      </w:r>
-      <w:r>
-        <w:rPr>
+          <w:sz w:val="24"/>
+        </w:rPr>
+        <w:t xml:space="preserve"> 簽署: </w:t>
+      </w:r>
+      <w:r>
+        <w:rPr>
+          <w:b/>
           <w:sz w:val="24"/>
         </w:rPr>
         <w:tab/>
-        <w:t>職級</w:t>
-      </w:r>
-      <w:r>
-        <w:rPr>
-          <w:rFonts w:hint="eastAsia"/>
-          <w:sz w:val="24"/>
-        </w:rPr>
-        <w:t xml:space="preserve"> </w:t>
-      </w:r>
-      <w:r>
-        <w:rPr>
-          <w:sz w:val="24"/>
-        </w:rPr>
-        <w:t xml:space="preserve">    </w:t>
-      </w:r>
-      <w:r>
-        <w:rPr>
-          <w:sz w:val="24"/>
-        </w:rPr>
-        <w:tab/>
-        <w:t>簽署</w:t>
-      </w:r>
-      <w:r>
-        <w:rPr>
-          <w:sz w:val="24"/>
-        </w:rPr>
-        <w:tab/>
-        <w:t>日期</w:t>
-      </w:r>
-      <w:r>
-        <w:rPr>
-          <w:rFonts w:hint="eastAsia"/>
-          <w:sz w:val="24"/>
-        </w:rPr>
-        <w:t xml:space="preserve"> </w:t>
-      </w:r>
-      <w:r>
-        <w:rPr>
-          <w:sz w:val="24"/>
-        </w:rPr>
-        <w:t xml:space="preserve"> </w:t>
-      </w:r>
-    </w:p>
-    <w:p>
-      <w:pPr>
-        <w:tabs>
-          <w:tab w:val="left" w:pos="4515"/>
-          <w:tab w:val="left" w:pos="6217"/>
-          <w:tab w:val="left" w:pos="8768"/>
-        </w:tabs>
-        <w:spacing w:line="20" w:lineRule="exact"/>
-        <w:ind w:left="2105"/>
-        <w:rPr>
-          <w:sz w:val="2"/>
-        </w:rPr>
-      </w:pPr>
-      <w:r>
-        <w:rPr>
-          <w:noProof/>
-          <w:sz w:val="2"/>
-        </w:rPr>
-        <w:t>{requestorName}</w:t>
-      </w:r>
-      <w:r>
-        <w:rPr>
-          <w:sz w:val="2"/>
-        </w:rPr>
-        <w:tab/>
-      </w:r>
-      <w:r>
-        <w:rPr>
-          <w:noProof/>
-          <w:sz w:val="2"/>
-        </w:rPr>
-        <w:t>{requestorRank}</w:t>
-      </w:r>
-      <w:r>
-        <w:rPr>
-          <w:sz w:val="2"/>
-        </w:rPr>
-        <w:tab/>
-      </w:r>
-      <w:r>
-        <w:rPr>
-          <w:noProof/>
-          <w:sz w:val="2"/>
-        </w:rPr>
-        <mc:AlternateContent>
-          <mc:Choice Requires="wpg">
-            <w:drawing>
-              <wp:inline distT="0" distB="0" distL="0" distR="0" wp14:anchorId="288A9679" wp14:editId="67BB5C59">
-                <wp:extent cx="1170940" cy="6350"/>
-                <wp:effectExtent l="13335" t="1905" r="6350" b="10795"/>
-                <wp:docPr id="30" name="Group 31"/>
-                <wp:cNvGraphicFramePr>
-                  <a:graphicFrameLocks xmlns:a="http://schemas.openxmlformats.org/drawingml/2006/main"/>
-                </wp:cNvGraphicFramePr>
-                <a:graphic xmlns:a="http://schemas.openxmlformats.org/drawingml/2006/main">
-                  <a:graphicData uri="http://schemas.microsoft.com/office/word/2010/wordprocessingGroup">
-                    <wpg:wgp>
-                      <wpg:cNvGrpSpPr>
-                        <a:grpSpLocks/>
-                      </wpg:cNvGrpSpPr>
-                      <wpg:grpSpPr bwMode="auto">
-                        <a:xfrm>
-                          <a:off x="0" y="0"/>
-                          <a:ext cx="1170940" cy="6350"/>
-                          <a:chOff x="0" y="0"/>
-                          <a:chExt cx="1844" cy="10"/>
-                        </a:xfrm>
-                      </wpg:grpSpPr>
-                      <wps:wsp>
-                        <wps:cNvPr id="31" name="Line 32"/>
-                        <wps:cNvCnPr>
-                          <a:cxnSpLocks noChangeShapeType="1"/>
-                        </wps:cNvCnPr>
-                        <wps:spPr bwMode="auto">
-                          <a:xfrm>
-                            <a:off x="0" y="5"/>
-                            <a:ext cx="1843" cy="0"/>
-                          </a:xfrm>
-                          <a:prstGeom prst="line">
-                            <a:avLst/>
-                          </a:prstGeom>
-                          <a:noFill/>
-                          <a:ln w="6096">
-                            <a:solidFill>
-                              <a:srgbClr val="000000"/>
-                            </a:solidFill>
-                            <a:prstDash val="solid"/>
-                            <a:round/>
-                            <a:headEnd/>
-                            <a:tailEnd/>
-                          </a:ln>
-                          <a:extLst>
-                            <a:ext uri="{909E8E84-426E-40DD-AFC4-6F175D3DCCD1}">
-                              <a14:hiddenFill xmlns:a14="http://schemas.microsoft.com/office/drawing/2010/main">
-                                <a:noFill/>
-                              </a14:hiddenFill>
-                            </a:ext>
-                          </a:extLst>
-                        </wps:spPr>
-                        <wps:bodyPr/>
-                      </wps:wsp>
-                    </wpg:wgp>
-                  </a:graphicData>
-                </a:graphic>
-              </wp:inline>
-            </w:drawing>
-          </mc:Choice>
-          <mc:Fallback>
-            <w:pict>
-              <v:group w14:anchorId="2F75DF2C" id="Group 31" o:spid="_x0000_s1026" style="width:92.2pt;height:.5pt;mso-position-horizontal-relative:char;mso-position-vertical-relative:line" coordsize="1844,10" o:gfxdata="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">
-                <v:line id="Line 32" o:spid="_x0000_s1027" style="position:absolute;visibility:visible;mso-wrap-style:square" from="0,5" to="1843,5" o:connectortype="straight" o:gfxdata="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" strokeweight=".48pt"/>
-                <w10:anchorlock/>
-              </v:group>
-            </w:pict>
-          </mc:Fallback>
-        </mc:AlternateContent>
-      </w:r>
-      <w:r>
-        <w:rPr>
-          <w:sz w:val="2"/>
-        </w:rPr>
-        <w:tab/>
-      </w:r>
-      <w:r>
-        <w:rPr>
-          <w:noProof/>
-          <w:sz w:val="2"/>
+        <w:t xml:space="preserve">日期: </w:t>
+      </w:r>
+      <w:r>
+        <w:rPr>
+          <w:sz w:val="24"/>
         </w:rPr>
         <w:t>{requestorDate}</w:t>
       </w:r>
     </w:p>
     <w:p>
       <w:pPr>
-        <w:pStyle w:val="a3"/>
+        <w:pStyle w:val="BodyText"/>
         <w:spacing w:before="12"/>
         <w:rPr>
           <w:sz w:val="7"/>
@@ -3084,7 +2923,7 @@
               </wp:anchor>
             </w:drawing>
           </mc:Choice>
-          <mc:Fallback>
+          <mc:Fallback xmlns:w16du="http://schemas.microsoft.com/office/word/2023/wordml/word16du" xmlns:w16sdtfl="http://schemas.microsoft.com/office/word/2024/wordml/sdtformatlock">
             <w:pict>
               <v:line w14:anchorId="47A198F2" id="Line 28" o:spid="_x0000_s1026" style="position:absolute;z-index:-251654144;visibility:visible;mso-wrap-style:square;mso-width-percent:0;mso-height-percent:0;mso-wrap-distance-left:0;mso-wrap-distance-top:0;mso-wrap-distance-right:0;mso-wrap-distance-bottom:0;mso-position-horizontal:absolute;mso-position-horizontal-relative:page;mso-position-vertical:absolute;mso-position-vertical-relative:text;mso-width-percent:0;mso-height-percent:0;mso-width-relative:page;mso-height-relative:page" from="21.3pt,8.2pt" to="574.15pt,8.2pt" o:gfxdata="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" strokeweight="1.5pt">
                 <w10:wrap type="topAndBottom" anchorx="page"/>
@@ -3096,7 +2935,7 @@
     </w:p>
     <w:p>
       <w:pPr>
-        <w:pStyle w:val="a3"/>
+        <w:pStyle w:val="BodyText"/>
         <w:spacing w:before="83" w:line="223" w:lineRule="auto"/>
         <w:ind w:left="124" w:right="308"/>
         <w:jc w:val="both"/>
@@ -3143,7 +2982,7 @@
     </w:p>
     <w:p>
       <w:pPr>
-        <w:pStyle w:val="a3"/>
+        <w:pStyle w:val="BodyText"/>
         <w:tabs>
           <w:tab w:val="left" w:pos="11073"/>
         </w:tabs>
@@ -3251,15 +3090,6 @@
         </w:rPr>
         <w:t>尚有足夠的預算。</w:t>
       </w:r>
-    </w:p>
-    <w:p>
-      <w:pPr>
-        <w:pStyle w:val="a3"/>
-        <w:spacing w:before="6"/>
-        <w:rPr>
-          <w:sz w:val="7"/>
-        </w:rPr>
-      </w:pPr>
     </w:p>
     <w:p>
       <w:pPr>
@@ -3277,221 +3107,64 @@
       <w:r>
         <w:rPr>
           <w:b/>
-          <w:spacing w:val="-4"/>
-          <w:sz w:val="24"/>
-        </w:rPr>
-        <w:t>科組負責</w:t>
+          <w:sz w:val="24"/>
+        </w:rPr>
+        <w:t xml:space="preserve">科組負責人 姓名: </w:t>
+      </w:r>
+      <w:r>
+        <w:rPr>
+          <w:sz w:val="24"/>
+        </w:rPr>
+        <w:t>{deptHeadName}</w:t>
       </w:r>
       <w:r>
         <w:rPr>
           <w:b/>
           <w:sz w:val="24"/>
         </w:rPr>
-        <w:t>人</w:t>
+        <w:tab/>
+        <w:t xml:space="preserve">職級: </w:t>
+      </w:r>
+      <w:r>
+        <w:rPr>
+          <w:sz w:val="24"/>
+        </w:rPr>
+        <w:t>{deptHeadRank}</w:t>
       </w:r>
       <w:r>
         <w:rPr>
           <w:b/>
-          <w:spacing w:val="49"/>
-          <w:sz w:val="24"/>
-        </w:rPr>
-        <w:t xml:space="preserve"> </w:t>
-      </w:r>
-      <w:r>
-        <w:rPr>
-          <w:sz w:val="24"/>
-        </w:rPr>
-        <w:t>姓名</w:t>
-      </w:r>
-      <w:r>
-        <w:rPr>
-          <w:rFonts w:hint="eastAsia"/>
-          <w:sz w:val="24"/>
-        </w:rPr>
-        <w:t xml:space="preserve"> </w:t>
-      </w:r>
-      <w:r>
-        <w:rPr>
-          <w:sz w:val="24"/>
-        </w:rPr>
-        <w:t xml:space="preserve">   </w:t>
-      </w:r>
-      <w:r>
-        <w:rPr>
+          <w:sz w:val="24"/>
+        </w:rPr>
+        <w:t xml:space="preserve">簽署: </w:t>
+      </w:r>
+      <w:r>
+        <w:rPr>
+          <w:b/>
           <w:sz w:val="24"/>
         </w:rPr>
         <w:tab/>
-        <w:t>職級</w:t>
-      </w:r>
-      <w:r>
-        <w:rPr>
-          <w:rFonts w:hint="eastAsia"/>
-          <w:sz w:val="24"/>
-        </w:rPr>
-        <w:t xml:space="preserve"> </w:t>
-      </w:r>
-      <w:r>
-        <w:rPr>
-          <w:sz w:val="24"/>
-        </w:rPr>
-        <w:tab/>
-        <w:t>簽署</w:t>
-      </w:r>
-      <w:r>
-        <w:rPr>
-          <w:sz w:val="24"/>
-        </w:rPr>
-        <w:tab/>
-        <w:t>日期</w:t>
-      </w:r>
-      <w:r>
-        <w:rPr>
-          <w:rFonts w:hint="eastAsia"/>
-          <w:sz w:val="24"/>
-        </w:rPr>
-        <w:t xml:space="preserve"> </w:t>
-      </w:r>
-      <w:r>
-        <w:rPr>
-          <w:sz w:val="24"/>
-        </w:rPr>
-        <w:t xml:space="preserve"> </w:t>
-      </w:r>
-    </w:p>
-    <w:p>
-      <w:pPr>
-        <w:tabs>
-          <w:tab w:val="left" w:pos="4515"/>
-          <w:tab w:val="left" w:pos="6217"/>
-          <w:tab w:val="left" w:pos="8768"/>
-        </w:tabs>
-        <w:spacing w:line="20" w:lineRule="exact"/>
-        <w:ind w:left="2105"/>
-        <w:rPr>
-          <w:sz w:val="2"/>
-        </w:rPr>
-      </w:pPr>
-      <w:r>
-        <w:rPr>
-          <w:noProof/>
-          <w:sz w:val="2"/>
-        </w:rPr>
-        <w:t>{deptHeadName}</w:t>
-      </w:r>
-      <w:r>
-        <w:rPr>
-          <w:sz w:val="2"/>
-        </w:rPr>
-        <w:tab/>
-      </w:r>
-      <w:r>
-        <w:rPr>
-          <w:noProof/>
-          <w:sz w:val="2"/>
-        </w:rPr>
-        <w:t>{deptHeadRank}</w:t>
-      </w:r>
-      <w:r>
-        <w:rPr>
-          <w:sz w:val="2"/>
-        </w:rPr>
-        <w:tab/>
-      </w:r>
-      <w:r>
-        <w:rPr>
-          <w:noProof/>
-          <w:sz w:val="2"/>
-        </w:rPr>
-        <mc:AlternateContent>
-          <mc:Choice Requires="wpg">
-            <w:drawing>
-              <wp:inline distT="0" distB="0" distL="0" distR="0" wp14:anchorId="1CC322C6" wp14:editId="0519CB64">
-                <wp:extent cx="1170940" cy="6350"/>
-                <wp:effectExtent l="13335" t="5715" r="6350" b="6985"/>
-                <wp:docPr id="21" name="Group 22"/>
-                <wp:cNvGraphicFramePr>
-                  <a:graphicFrameLocks xmlns:a="http://schemas.openxmlformats.org/drawingml/2006/main"/>
-                </wp:cNvGraphicFramePr>
-                <a:graphic xmlns:a="http://schemas.openxmlformats.org/drawingml/2006/main">
-                  <a:graphicData uri="http://schemas.microsoft.com/office/word/2010/wordprocessingGroup">
-                    <wpg:wgp>
-                      <wpg:cNvGrpSpPr>
-                        <a:grpSpLocks/>
-                      </wpg:cNvGrpSpPr>
-                      <wpg:grpSpPr bwMode="auto">
-                        <a:xfrm>
-                          <a:off x="0" y="0"/>
-                          <a:ext cx="1170940" cy="6350"/>
-                          <a:chOff x="0" y="0"/>
-                          <a:chExt cx="1844" cy="10"/>
-                        </a:xfrm>
-                      </wpg:grpSpPr>
-                      <wps:wsp>
-                        <wps:cNvPr id="22" name="Line 23"/>
-                        <wps:cNvCnPr>
-                          <a:cxnSpLocks noChangeShapeType="1"/>
-                        </wps:cNvCnPr>
-                        <wps:spPr bwMode="auto">
-                          <a:xfrm>
-                            <a:off x="0" y="5"/>
-                            <a:ext cx="1843" cy="0"/>
-                          </a:xfrm>
-                          <a:prstGeom prst="line">
-                            <a:avLst/>
-                          </a:prstGeom>
-                          <a:noFill/>
-                          <a:ln w="6096">
-                            <a:solidFill>
-                              <a:srgbClr val="000000"/>
-                            </a:solidFill>
-                            <a:prstDash val="solid"/>
-                            <a:round/>
-                            <a:headEnd/>
-                            <a:tailEnd/>
-                          </a:ln>
-                          <a:extLst>
-                            <a:ext uri="{909E8E84-426E-40DD-AFC4-6F175D3DCCD1}">
-                              <a14:hiddenFill xmlns:a14="http://schemas.microsoft.com/office/drawing/2010/main">
-                                <a:noFill/>
-                              </a14:hiddenFill>
-                            </a:ext>
-                          </a:extLst>
-                        </wps:spPr>
-                        <wps:bodyPr/>
-                      </wps:wsp>
-                    </wpg:wgp>
-                  </a:graphicData>
-                </a:graphic>
-              </wp:inline>
-            </w:drawing>
-          </mc:Choice>
-          <mc:Fallback>
-            <w:pict>
-              <v:group w14:anchorId="33F04952" id="Group 22" o:spid="_x0000_s1026" style="width:92.2pt;height:.5pt;mso-position-horizontal-relative:char;mso-position-vertical-relative:line" coordsize="1844,10" o:gfxdata="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">
-                <v:line id="Line 23" o:spid="_x0000_s1027" style="position:absolute;visibility:visible;mso-wrap-style:square" from="0,5" to="1843,5" o:connectortype="straight" o:gfxdata="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" strokeweight=".48pt"/>
-                <w10:anchorlock/>
-              </v:group>
-            </w:pict>
-          </mc:Fallback>
-        </mc:AlternateContent>
-      </w:r>
-      <w:r>
-        <w:rPr>
-          <w:sz w:val="2"/>
-        </w:rPr>
-        <w:tab/>
-      </w:r>
-      <w:r>
-        <w:rPr>
-          <w:noProof/>
-          <w:sz w:val="2"/>
+        <w:t xml:space="preserve">日期: </w:t>
+      </w:r>
+      <w:r>
+        <w:rPr>
+          <w:sz w:val="24"/>
         </w:rPr>
         <w:t>{deptHeadDate}</w:t>
       </w:r>
     </w:p>
     <w:p>
       <w:pPr>
-        <w:pStyle w:val="a3"/>
+        <w:pStyle w:val="BodyText"/>
+        <w:spacing w:before="6"/>
+        <w:rPr>
+          <w:sz w:val="7"/>
+        </w:rPr>
+      </w:pPr>
+    </w:p>
+    <w:p>
+      <w:pPr>
+        <w:pStyle w:val="BodyText"/>
         <w:spacing w:before="12"/>
         <w:rPr>
           <w:sz w:val="7"/>
@@ -3809,7 +3482,7 @@
               </wp:anchor>
             </w:drawing>
           </mc:Choice>
-          <mc:Fallback>
+          <mc:Fallback xmlns:w16du="http://schemas.microsoft.com/office/word/2023/wordml/word16du" xmlns:w16sdtfl="http://schemas.microsoft.com/office/word/2024/wordml/sdtformatlock">
             <w:pict>
               <v:group w14:anchorId="5D7BAA26" id="Group 11" o:spid="_x0000_s1026" style="position:absolute;margin-left:20.6pt;margin-top:7.45pt;width:553.6pt;height:1.5pt;z-index:-251649024;mso-wrap-distance-left:0;mso-wrap-distance-right:0;mso-position-horizontal-relative:page" coordorigin="412,149" coordsize="11072,30" o:gfxdata="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">
                 <v:line id="Line 19" o:spid="_x0000_s1027" style="position:absolute;visibility:visible;mso-wrap-style:square" from="412,164" to="2411,164" o:connectortype="straight" o:gfxdata="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" strokeweight="1.5pt"/>
@@ -3829,7 +3502,7 @@
     </w:p>
     <w:p>
       <w:pPr>
-        <w:pStyle w:val="a3"/>
+        <w:pStyle w:val="BodyText"/>
         <w:spacing w:before="6"/>
         <w:rPr>
           <w:sz w:val="5"/>
@@ -3838,7 +3511,7 @@
     </w:p>
     <w:p>
       <w:pPr>
-        <w:pStyle w:val="a3"/>
+        <w:pStyle w:val="BodyText"/>
         <w:spacing w:before="80" w:line="223" w:lineRule="auto"/>
         <w:ind w:left="125" w:right="342" w:hanging="3"/>
         <w:jc w:val="both"/>
@@ -3885,7 +3558,7 @@
     </w:p>
     <w:p>
       <w:pPr>
-        <w:pStyle w:val="a3"/>
+        <w:pStyle w:val="BodyText"/>
         <w:tabs>
           <w:tab w:val="left" w:pos="11039"/>
         </w:tabs>
@@ -3921,7 +3594,7 @@
     </w:p>
     <w:p>
       <w:pPr>
-        <w:pStyle w:val="a4"/>
+        <w:pStyle w:val="ListParagraph"/>
         <w:numPr>
           <w:ilvl w:val="0"/>
           <w:numId w:val="1"/>
@@ -3944,7 +3617,7 @@
     </w:p>
     <w:p>
       <w:pPr>
-        <w:pStyle w:val="a4"/>
+        <w:pStyle w:val="ListParagraph"/>
         <w:numPr>
           <w:ilvl w:val="0"/>
           <w:numId w:val="1"/>
@@ -3967,7 +3640,7 @@
     </w:p>
     <w:p>
       <w:pPr>
-        <w:pStyle w:val="a4"/>
+        <w:pStyle w:val="ListParagraph"/>
         <w:numPr>
           <w:ilvl w:val="0"/>
           <w:numId w:val="1"/>
@@ -4014,16 +3687,6 @@
     </w:p>
     <w:p>
       <w:pPr>
-        <w:pStyle w:val="a3"/>
-        <w:spacing w:before="4"/>
-        <w:rPr>
-          <w:rFonts w:ascii="Times New Roman"/>
-          <w:sz w:val="17"/>
-        </w:rPr>
-      </w:pPr>
-    </w:p>
-    <w:p>
-      <w:pPr>
         <w:tabs>
           <w:tab w:val="left" w:pos="3223"/>
           <w:tab w:val="left" w:pos="3976"/>
@@ -4033,426 +3696,62 @@
         <w:spacing w:before="54"/>
         <w:ind w:left="124"/>
         <w:rPr>
-          <w:sz w:val="24"/>
+          <w:sz w:val="2"/>
         </w:rPr>
       </w:pPr>
       <w:r>
         <w:rPr>
           <w:b/>
-          <w:spacing w:val="-4"/>
-          <w:sz w:val="24"/>
-        </w:rPr>
-        <w:t>批核</w:t>
+          <w:sz w:val="24"/>
+        </w:rPr>
+        <w:t xml:space="preserve">批核人 姓名: </w:t>
+      </w:r>
+      <w:r>
+        <w:rPr>
+          <w:sz w:val="24"/>
+        </w:rPr>
+        <w:t>{approverName}</w:t>
       </w:r>
       <w:r>
         <w:rPr>
           <w:b/>
           <w:sz w:val="24"/>
         </w:rPr>
-        <w:t>人</w:t>
+        <w:tab/>
+        <w:t xml:space="preserve">職級: </w:t>
+      </w:r>
+      <w:r>
+        <w:rPr>
+          <w:sz w:val="24"/>
+        </w:rPr>
+        <w:t>{approverRank}</w:t>
       </w:r>
       <w:r>
         <w:rPr>
           <w:b/>
-          <w:spacing w:val="48"/>
-          <w:sz w:val="24"/>
-        </w:rPr>
-        <w:t xml:space="preserve"> </w:t>
-      </w:r>
-      <w:r>
-        <w:rPr>
-          <w:sz w:val="24"/>
-        </w:rPr>
-        <w:t>姓名</w:t>
-      </w:r>
-      <w:r>
-        <w:rPr>
           <w:sz w:val="24"/>
         </w:rPr>
         <w:tab/>
-        <w:t>職級</w:t>
-      </w:r>
-      <w:r>
-        <w:rPr>
+        <w:t xml:space="preserve">校長/副校長簽署: </w:t>
+      </w:r>
+      <w:r>
+        <w:rPr>
+          <w:b/>
           <w:sz w:val="24"/>
         </w:rPr>
         <w:tab/>
-      </w:r>
-      <w:r>
-        <w:rPr>
-          <w:i/>
-          <w:sz w:val="25"/>
-        </w:rPr>
-        <w:t>校長/副校長</w:t>
-      </w:r>
-      <w:r>
-        <w:rPr>
-          <w:i/>
-          <w:sz w:val="25"/>
-        </w:rPr>
-        <w:tab/>
-      </w:r>
-      <w:r>
-        <w:rPr>
-          <w:sz w:val="24"/>
-        </w:rPr>
-        <w:t>簽署</w:t>
-      </w:r>
-      <w:r>
-        <w:rPr>
-          <w:sz w:val="24"/>
-        </w:rPr>
-        <w:tab/>
-        <w:t>日期</w:t>
-      </w:r>
-    </w:p>
-    <w:p>
-      <w:pPr>
-        <w:tabs>
-          <w:tab w:val="left" w:pos="3791"/>
-          <w:tab w:val="left" w:pos="6202"/>
-          <w:tab w:val="left" w:pos="8753"/>
-        </w:tabs>
-        <w:spacing w:line="20" w:lineRule="exact"/>
-        <w:ind w:left="1523"/>
-        <w:rPr>
-          <w:sz w:val="2"/>
-        </w:rPr>
-      </w:pPr>
-      <w:r>
-        <w:rPr>
-          <w:noProof/>
-          <w:sz w:val="2"/>
-        </w:rPr>
-        <mc:AlternateContent>
-          <mc:Choice Requires="wpg">
-            <w:drawing>
-              <wp:inline distT="0" distB="0" distL="0" distR="0" wp14:anchorId="46E3B3D5" wp14:editId="2876C8A0">
-                <wp:extent cx="1000125" cy="6350"/>
-                <wp:effectExtent l="5715" t="5715" r="13335" b="6985"/>
-                <wp:docPr id="8" name="Group 9"/>
-                <wp:cNvGraphicFramePr>
-                  <a:graphicFrameLocks xmlns:a="http://schemas.openxmlformats.org/drawingml/2006/main"/>
-                </wp:cNvGraphicFramePr>
-                <a:graphic xmlns:a="http://schemas.openxmlformats.org/drawingml/2006/main">
-                  <a:graphicData uri="http://schemas.microsoft.com/office/word/2010/wordprocessingGroup">
-                    <wpg:wgp>
-                      <wpg:cNvGrpSpPr>
-                        <a:grpSpLocks/>
-                      </wpg:cNvGrpSpPr>
-                      <wpg:grpSpPr bwMode="auto">
-                        <a:xfrm>
-                          <a:off x="0" y="0"/>
-                          <a:ext cx="1000125" cy="6350"/>
-                          <a:chOff x="0" y="0"/>
-                          <a:chExt cx="1575" cy="10"/>
-                        </a:xfrm>
-                      </wpg:grpSpPr>
-                      <wps:wsp>
-                        <wps:cNvPr id="9" name="Line 10"/>
-                        <wps:cNvCnPr>
-                          <a:cxnSpLocks noChangeShapeType="1"/>
-                        </wps:cNvCnPr>
-                        <wps:spPr bwMode="auto">
-                          <a:xfrm>
-                            <a:off x="0" y="5"/>
-                            <a:ext cx="1574" cy="0"/>
-                          </a:xfrm>
-                          <a:prstGeom prst="line">
-                            <a:avLst/>
-                          </a:prstGeom>
-                          <a:noFill/>
-                          <a:ln w="6096">
-                            <a:solidFill>
-                              <a:srgbClr val="000000"/>
-                            </a:solidFill>
-                            <a:prstDash val="solid"/>
-                            <a:round/>
-                            <a:headEnd/>
-                            <a:tailEnd/>
-                          </a:ln>
-                          <a:extLst>
-                            <a:ext uri="{909E8E84-426E-40DD-AFC4-6F175D3DCCD1}">
-                              <a14:hiddenFill xmlns:a14="http://schemas.microsoft.com/office/drawing/2010/main">
-                                <a:noFill/>
-                              </a14:hiddenFill>
-                            </a:ext>
-                          </a:extLst>
-                        </wps:spPr>
-                        <wps:bodyPr/>
-                      </wps:wsp>
-                    </wpg:wgp>
-                  </a:graphicData>
-                </a:graphic>
-              </wp:inline>
-            </w:drawing>
-          </mc:Choice>
-          <mc:Fallback>
-            <w:pict>
-              <v:group w14:anchorId="72051AF7" id="Group 9" o:spid="_x0000_s1026" style="width:78.75pt;height:.5pt;mso-position-horizontal-relative:char;mso-position-vertical-relative:line" coordsize="1575,10" o:gfxdata="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">
-                <v:line id="Line 10" o:spid="_x0000_s1027" style="position:absolute;visibility:visible;mso-wrap-style:square" from="0,5" to="1574,5" o:connectortype="straight" o:gfxdata="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" strokeweight=".48pt"/>
-                <w10:anchorlock/>
-              </v:group>
-            </w:pict>
-          </mc:Fallback>
-        </mc:AlternateContent>
-      </w:r>
-      <w:r>
-        <w:rPr>
-          <w:sz w:val="2"/>
-        </w:rPr>
-        <w:tab/>
-      </w:r>
-      <w:r>
-        <w:rPr>
-          <w:noProof/>
-          <w:sz w:val="2"/>
-        </w:rPr>
-        <mc:AlternateContent>
-          <mc:Choice Requires="wpg">
-            <w:drawing>
-              <wp:inline distT="0" distB="0" distL="0" distR="0" wp14:anchorId="6FFB5838" wp14:editId="18746218">
-                <wp:extent cx="1089660" cy="6350"/>
-                <wp:effectExtent l="11430" t="5715" r="13335" b="6985"/>
-                <wp:docPr id="6" name="Group 7"/>
-                <wp:cNvGraphicFramePr>
-                  <a:graphicFrameLocks xmlns:a="http://schemas.openxmlformats.org/drawingml/2006/main"/>
-                </wp:cNvGraphicFramePr>
-                <a:graphic xmlns:a="http://schemas.openxmlformats.org/drawingml/2006/main">
-                  <a:graphicData uri="http://schemas.microsoft.com/office/word/2010/wordprocessingGroup">
-                    <wpg:wgp>
-                      <wpg:cNvGrpSpPr>
-                        <a:grpSpLocks/>
-                      </wpg:cNvGrpSpPr>
-                      <wpg:grpSpPr bwMode="auto">
-                        <a:xfrm>
-                          <a:off x="0" y="0"/>
-                          <a:ext cx="1089660" cy="6350"/>
-                          <a:chOff x="0" y="0"/>
-                          <a:chExt cx="1716" cy="10"/>
-                        </a:xfrm>
-                      </wpg:grpSpPr>
-                      <wps:wsp>
-                        <wps:cNvPr id="7" name="Line 8"/>
-                        <wps:cNvCnPr>
-                          <a:cxnSpLocks noChangeShapeType="1"/>
-                        </wps:cNvCnPr>
-                        <wps:spPr bwMode="auto">
-                          <a:xfrm>
-                            <a:off x="0" y="5"/>
-                            <a:ext cx="1716" cy="0"/>
-                          </a:xfrm>
-                          <a:prstGeom prst="line">
-                            <a:avLst/>
-                          </a:prstGeom>
-                          <a:noFill/>
-                          <a:ln w="6096">
-                            <a:solidFill>
-                              <a:srgbClr val="000000"/>
-                            </a:solidFill>
-                            <a:prstDash val="solid"/>
-                            <a:round/>
-                            <a:headEnd/>
-                            <a:tailEnd/>
-                          </a:ln>
-                          <a:extLst>
-                            <a:ext uri="{909E8E84-426E-40DD-AFC4-6F175D3DCCD1}">
-                              <a14:hiddenFill xmlns:a14="http://schemas.microsoft.com/office/drawing/2010/main">
-                                <a:noFill/>
-                              </a14:hiddenFill>
-                            </a:ext>
-                          </a:extLst>
-                        </wps:spPr>
-                        <wps:bodyPr/>
-                      </wps:wsp>
-                    </wpg:wgp>
-                  </a:graphicData>
-                </a:graphic>
-              </wp:inline>
-            </w:drawing>
-          </mc:Choice>
-          <mc:Fallback>
-            <w:pict>
-              <v:group w14:anchorId="4AE2187E" id="Group 7" o:spid="_x0000_s1026" style="width:85.8pt;height:.5pt;mso-position-horizontal-relative:char;mso-position-vertical-relative:line" coordsize="1716,10" o:gfxdata="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">
-                <v:line id="Line 8" o:spid="_x0000_s1027" style="position:absolute;visibility:visible;mso-wrap-style:square" from="0,5" to="1716,5" o:connectortype="straight" o:gfxdata="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" strokeweight=".48pt"/>
-                <w10:anchorlock/>
-              </v:group>
-            </w:pict>
-          </mc:Fallback>
-        </mc:AlternateContent>
-      </w:r>
-      <w:r>
-        <w:rPr>
-          <w:sz w:val="2"/>
-        </w:rPr>
-        <w:tab/>
-      </w:r>
-      <w:r>
-        <w:rPr>
-          <w:noProof/>
-          <w:sz w:val="2"/>
-        </w:rPr>
-        <mc:AlternateContent>
-          <mc:Choice Requires="wpg">
-            <w:drawing>
-              <wp:inline distT="0" distB="0" distL="0" distR="0" wp14:anchorId="43E3EF09" wp14:editId="1A560E94">
-                <wp:extent cx="1179195" cy="6350"/>
-                <wp:effectExtent l="13335" t="5715" r="7620" b="6985"/>
-                <wp:docPr id="4" name="Group 5"/>
-                <wp:cNvGraphicFramePr>
-                  <a:graphicFrameLocks xmlns:a="http://schemas.openxmlformats.org/drawingml/2006/main"/>
-                </wp:cNvGraphicFramePr>
-                <a:graphic xmlns:a="http://schemas.openxmlformats.org/drawingml/2006/main">
-                  <a:graphicData uri="http://schemas.microsoft.com/office/word/2010/wordprocessingGroup">
-                    <wpg:wgp>
-                      <wpg:cNvGrpSpPr>
-                        <a:grpSpLocks/>
-                      </wpg:cNvGrpSpPr>
-                      <wpg:grpSpPr bwMode="auto">
-                        <a:xfrm>
-                          <a:off x="0" y="0"/>
-                          <a:ext cx="1179195" cy="6350"/>
-                          <a:chOff x="0" y="0"/>
-                          <a:chExt cx="1857" cy="10"/>
-                        </a:xfrm>
-                      </wpg:grpSpPr>
-                      <wps:wsp>
-                        <wps:cNvPr id="5" name="Line 6"/>
-                        <wps:cNvCnPr>
-                          <a:cxnSpLocks noChangeShapeType="1"/>
-                        </wps:cNvCnPr>
-                        <wps:spPr bwMode="auto">
-                          <a:xfrm>
-                            <a:off x="0" y="5"/>
-                            <a:ext cx="1856" cy="0"/>
-                          </a:xfrm>
-                          <a:prstGeom prst="line">
-                            <a:avLst/>
-                          </a:prstGeom>
-                          <a:noFill/>
-                          <a:ln w="6096">
-                            <a:solidFill>
-                              <a:srgbClr val="000000"/>
-                            </a:solidFill>
-                            <a:prstDash val="solid"/>
-                            <a:round/>
-                            <a:headEnd/>
-                            <a:tailEnd/>
-                          </a:ln>
-                          <a:extLst>
-                            <a:ext uri="{909E8E84-426E-40DD-AFC4-6F175D3DCCD1}">
-                              <a14:hiddenFill xmlns:a14="http://schemas.microsoft.com/office/drawing/2010/main">
-                                <a:noFill/>
-                              </a14:hiddenFill>
-                            </a:ext>
-                          </a:extLst>
-                        </wps:spPr>
-                        <wps:bodyPr/>
-                      </wps:wsp>
-                    </wpg:wgp>
-                  </a:graphicData>
-                </a:graphic>
-              </wp:inline>
-            </w:drawing>
-          </mc:Choice>
-          <mc:Fallback>
-            <w:pict>
-              <v:group w14:anchorId="725DA12D" id="Group 5" o:spid="_x0000_s1026" style="width:92.85pt;height:.5pt;mso-position-horizontal-relative:char;mso-position-vertical-relative:line" coordsize="1857,10" o:gfxdata="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">
-                <v:line id="Line 6" o:spid="_x0000_s1027" style="position:absolute;visibility:visible;mso-wrap-style:square" from="0,5" to="1856,5" o:connectortype="straight" o:gfxdata="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" strokeweight=".48pt"/>
-                <w10:anchorlock/>
-              </v:group>
-            </w:pict>
-          </mc:Fallback>
-        </mc:AlternateContent>
-      </w:r>
-      <w:r>
-        <w:rPr>
-          <w:sz w:val="2"/>
-        </w:rPr>
-        <w:tab/>
-      </w:r>
-      <w:r>
-        <w:rPr>
-          <w:noProof/>
-          <w:sz w:val="2"/>
-        </w:rPr>
-        <mc:AlternateContent>
-          <mc:Choice Requires="wpg">
-            <w:drawing>
-              <wp:inline distT="0" distB="0" distL="0" distR="0" wp14:anchorId="727A033A" wp14:editId="4DDAC281">
-                <wp:extent cx="1539240" cy="6350"/>
-                <wp:effectExtent l="5715" t="5715" r="7620" b="6985"/>
-                <wp:docPr id="2" name="Group 3"/>
-                <wp:cNvGraphicFramePr>
-                  <a:graphicFrameLocks xmlns:a="http://schemas.openxmlformats.org/drawingml/2006/main"/>
-                </wp:cNvGraphicFramePr>
-                <a:graphic xmlns:a="http://schemas.openxmlformats.org/drawingml/2006/main">
-                  <a:graphicData uri="http://schemas.microsoft.com/office/word/2010/wordprocessingGroup">
-                    <wpg:wgp>
-                      <wpg:cNvGrpSpPr>
-                        <a:grpSpLocks/>
-                      </wpg:cNvGrpSpPr>
-                      <wpg:grpSpPr bwMode="auto">
-                        <a:xfrm>
-                          <a:off x="0" y="0"/>
-                          <a:ext cx="1539240" cy="6350"/>
-                          <a:chOff x="0" y="0"/>
-                          <a:chExt cx="2424" cy="10"/>
-                        </a:xfrm>
-                      </wpg:grpSpPr>
-                      <wps:wsp>
-                        <wps:cNvPr id="3" name="Line 4"/>
-                        <wps:cNvCnPr>
-                          <a:cxnSpLocks noChangeShapeType="1"/>
-                        </wps:cNvCnPr>
-                        <wps:spPr bwMode="auto">
-                          <a:xfrm>
-                            <a:off x="0" y="5"/>
-                            <a:ext cx="2424" cy="0"/>
-                          </a:xfrm>
-                          <a:prstGeom prst="line">
-                            <a:avLst/>
-                          </a:prstGeom>
-                          <a:noFill/>
-                          <a:ln w="6096">
-                            <a:solidFill>
-                              <a:srgbClr val="000000"/>
-                            </a:solidFill>
-                            <a:prstDash val="solid"/>
-                            <a:round/>
-                            <a:headEnd/>
-                            <a:tailEnd/>
-                          </a:ln>
-                          <a:extLst>
-                            <a:ext uri="{909E8E84-426E-40DD-AFC4-6F175D3DCCD1}">
-                              <a14:hiddenFill xmlns:a14="http://schemas.microsoft.com/office/drawing/2010/main">
-                                <a:noFill/>
-                              </a14:hiddenFill>
-                            </a:ext>
-                          </a:extLst>
-                        </wps:spPr>
-                        <wps:bodyPr/>
-                      </wps:wsp>
-                    </wpg:wgp>
-                  </a:graphicData>
-                </a:graphic>
-              </wp:inline>
-            </w:drawing>
-          </mc:Choice>
-          <mc:Fallback>
-            <w:pict>
-              <v:group w14:anchorId="2EA9BB5B" id="Group 3" o:spid="_x0000_s1026" style="width:121.2pt;height:.5pt;mso-position-horizontal-relative:char;mso-position-vertical-relative:line" coordsize="2424,10" o:gfxdata="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">
-                <v:line id="Line 4" o:spid="_x0000_s1027" style="position:absolute;visibility:visible;mso-wrap-style:square" from="0,5" to="2424,5" o:connectortype="straight" o:gfxdata="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" strokeweight=".48pt"/>
-                <w10:anchorlock/>
-              </v:group>
-            </w:pict>
-          </mc:Fallback>
-        </mc:AlternateContent>
-      </w:r>
-    </w:p>
-    <w:p>
-      <w:pPr>
-        <w:pStyle w:val="a3"/>
+        <w:t xml:space="preserve">日期: </w:t>
+      </w:r>
+      <w:r>
+        <w:rPr>
+          <w:sz w:val="24"/>
+        </w:rPr>
+        <w:t>{approverDate}</w:t>
+      </w:r>
+    </w:p>
+    <w:p>
+      <w:pPr>
+        <w:pStyle w:val="BodyText"/>
         <w:spacing w:before="7"/>
         <w:rPr>
           <w:sz w:val="17"/>
@@ -4531,7 +3830,7 @@
     </w:p>
     <w:p>
       <w:pPr>
-        <w:pStyle w:val="a3"/>
+        <w:pStyle w:val="BodyText"/>
         <w:spacing w:before="6"/>
         <w:rPr>
           <w:rFonts w:ascii="Times New Roman"/>
@@ -4567,7 +3866,7 @@
     </w:p>
     <w:p>
       <w:pPr>
-        <w:pStyle w:val="a3"/>
+        <w:pStyle w:val="BodyText"/>
         <w:spacing w:before="3"/>
         <w:rPr>
           <w:rFonts w:ascii="Times New Roman"/>
@@ -4624,7 +3923,7 @@
     </w:p>
     <w:p>
       <w:pPr>
-        <w:pStyle w:val="a3"/>
+        <w:pStyle w:val="BodyText"/>
         <w:rPr>
           <w:rFonts w:ascii="Times New Roman"/>
           <w:sz w:val="22"/>
@@ -4634,7 +3933,7 @@
     </w:p>
     <w:p>
       <w:pPr>
-        <w:pStyle w:val="a3"/>
+        <w:pStyle w:val="BodyText"/>
         <w:rPr>
           <w:rFonts w:ascii="Times New Roman"/>
           <w:sz w:val="22"/>
@@ -4644,7 +3943,7 @@
     </w:p>
     <w:p>
       <w:pPr>
-        <w:pStyle w:val="a3"/>
+        <w:pStyle w:val="BodyText"/>
         <w:rPr>
           <w:rFonts w:ascii="Times New Roman"/>
           <w:sz w:val="22"/>
@@ -4654,7 +3953,7 @@
     </w:p>
     <w:p>
       <w:pPr>
-        <w:pStyle w:val="a3"/>
+        <w:pStyle w:val="BodyText"/>
         <w:spacing w:before="11"/>
         <w:rPr>
           <w:rFonts w:ascii="Times New Roman"/>
@@ -4677,6 +3976,7 @@
         <w:rPr>
           <w:rFonts w:ascii="Times New Roman" w:eastAsia="Times New Roman"/>
           <w:b/>
+          <w:sz w:val="24"/>
           <w:lang w:val="en-US"/>
         </w:rPr>
         <w:t xml:space="preserve">&lt;  </w:t>
@@ -4684,12 +3984,14 @@
       <w:r>
         <w:rPr>
           <w:b/>
+          <w:sz w:val="24"/>
         </w:rPr>
         <w:t>查核紀錄</w:t>
       </w:r>
       <w:r>
         <w:rPr>
           <w:b/>
+          <w:sz w:val="24"/>
           <w:lang w:val="en-US"/>
         </w:rPr>
         <w:t xml:space="preserve"> </w:t>
@@ -4698,6 +4000,7 @@
         <w:rPr>
           <w:rFonts w:ascii="Times New Roman" w:eastAsia="Times New Roman"/>
           <w:b/>
+          <w:sz w:val="24"/>
           <w:lang w:val="en-US"/>
         </w:rPr>
         <w:t>Random Vetting &gt;</w:t>
@@ -4705,7 +4008,7 @@
     </w:p>
     <w:p>
       <w:pPr>
-        <w:pStyle w:val="a3"/>
+        <w:pStyle w:val="BodyText"/>
         <w:rPr>
           <w:rFonts w:ascii="Times New Roman"/>
           <w:b/>
@@ -4747,7 +4050,7 @@
     </w:p>
     <w:p>
       <w:pPr>
-        <w:pStyle w:val="a3"/>
+        <w:pStyle w:val="BodyText"/>
         <w:spacing w:before="4"/>
         <w:rPr>
           <w:rFonts w:ascii="Times New Roman"/>
@@ -4802,7 +4105,7 @@
     </w:p>
     <w:p>
       <w:pPr>
-        <w:pStyle w:val="a3"/>
+        <w:pStyle w:val="BodyText"/>
         <w:rPr>
           <w:rFonts w:ascii="Times New Roman"/>
           <w:sz w:val="20"/>
@@ -4812,7 +4115,7 @@
     </w:p>
     <w:p>
       <w:pPr>
-        <w:pStyle w:val="a3"/>
+        <w:pStyle w:val="BodyText"/>
         <w:rPr>
           <w:rFonts w:ascii="Times New Roman"/>
           <w:sz w:val="20"/>
@@ -4822,7 +4125,7 @@
     </w:p>
     <w:p>
       <w:pPr>
-        <w:pStyle w:val="a3"/>
+        <w:pStyle w:val="BodyText"/>
         <w:rPr>
           <w:rFonts w:ascii="Times New Roman"/>
           <w:sz w:val="20"/>
@@ -4832,7 +4135,7 @@
     </w:p>
     <w:p>
       <w:pPr>
-        <w:pStyle w:val="a3"/>
+        <w:pStyle w:val="BodyText"/>
         <w:rPr>
           <w:rFonts w:ascii="Times New Roman"/>
           <w:sz w:val="20"/>
@@ -4842,7 +4145,7 @@
     </w:p>
     <w:p>
       <w:pPr>
-        <w:pStyle w:val="a3"/>
+        <w:pStyle w:val="BodyText"/>
         <w:rPr>
           <w:rFonts w:ascii="Times New Roman"/>
           <w:sz w:val="20"/>
@@ -4852,7 +4155,7 @@
     </w:p>
     <w:p>
       <w:pPr>
-        <w:pStyle w:val="a3"/>
+        <w:pStyle w:val="BodyText"/>
         <w:rPr>
           <w:rFonts w:ascii="Times New Roman"/>
           <w:sz w:val="20"/>
@@ -4862,7 +4165,7 @@
     </w:p>
     <w:p>
       <w:pPr>
-        <w:pStyle w:val="a3"/>
+        <w:pStyle w:val="BodyText"/>
         <w:rPr>
           <w:rFonts w:ascii="Times New Roman"/>
           <w:sz w:val="20"/>
@@ -4872,7 +4175,7 @@
     </w:p>
     <w:p>
       <w:pPr>
-        <w:pStyle w:val="a3"/>
+        <w:pStyle w:val="BodyText"/>
         <w:rPr>
           <w:rFonts w:ascii="Times New Roman"/>
           <w:sz w:val="20"/>
@@ -4882,7 +4185,7 @@
     </w:p>
     <w:p>
       <w:pPr>
-        <w:pStyle w:val="a3"/>
+        <w:pStyle w:val="BodyText"/>
         <w:rPr>
           <w:rFonts w:ascii="Times New Roman"/>
           <w:sz w:val="20"/>
@@ -4892,7 +4195,7 @@
     </w:p>
     <w:p>
       <w:pPr>
-        <w:pStyle w:val="a3"/>
+        <w:pStyle w:val="BodyText"/>
         <w:spacing w:before="6"/>
         <w:rPr>
           <w:rFonts w:ascii="Times New Roman"/>
@@ -4967,7 +4270,7 @@
               </wp:anchor>
             </w:drawing>
           </mc:Choice>
-          <mc:Fallback>
+          <mc:Fallback xmlns:w16du="http://schemas.microsoft.com/office/word/2023/wordml/word16du" xmlns:w16sdtfl="http://schemas.microsoft.com/office/word/2024/wordml/sdtformatlock">
             <w:pict>
               <v:line w14:anchorId="486B18AC" id="Line 2" o:spid="_x0000_s1026" style="position:absolute;z-index:-251640832;visibility:visible;mso-wrap-style:square;mso-width-percent:0;mso-height-percent:0;mso-wrap-distance-left:0;mso-wrap-distance-top:0;mso-wrap-distance-right:0;mso-wrap-distance-bottom:0;mso-position-horizontal:absolute;mso-position-horizontal-relative:page;mso-position-vertical:absolute;mso-position-vertical-relative:text;mso-width-percent:0;mso-height-percent:0;mso-width-relative:page;mso-height-relative:page" from="28.4pt,10pt" to="123.35pt,10pt" o:gfxdata="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" strokeweight=".48pt">
                 <w10:wrap type="topAndBottom" anchorx="page"/>
@@ -4979,7 +4282,7 @@
     </w:p>
     <w:p>
       <w:pPr>
-        <w:pStyle w:val="a3"/>
+        <w:pStyle w:val="BodyText"/>
         <w:rPr>
           <w:rFonts w:ascii="Times New Roman"/>
           <w:sz w:val="20"/>
@@ -4989,7 +4292,7 @@
     </w:p>
     <w:p>
       <w:pPr>
-        <w:pStyle w:val="a3"/>
+        <w:pStyle w:val="BodyText"/>
         <w:rPr>
           <w:rFonts w:ascii="Times New Roman"/>
           <w:sz w:val="20"/>
@@ -4999,7 +4302,7 @@
     </w:p>
     <w:p>
       <w:pPr>
-        <w:pStyle w:val="a3"/>
+        <w:pStyle w:val="BodyText"/>
         <w:rPr>
           <w:rFonts w:ascii="Times New Roman"/>
           <w:sz w:val="20"/>
@@ -5009,7 +4312,7 @@
     </w:p>
     <w:p>
       <w:pPr>
-        <w:pStyle w:val="a3"/>
+        <w:pStyle w:val="BodyText"/>
         <w:rPr>
           <w:rFonts w:ascii="Times New Roman"/>
           <w:sz w:val="20"/>
@@ -5019,7 +4322,7 @@
     </w:p>
     <w:p>
       <w:pPr>
-        <w:pStyle w:val="a3"/>
+        <w:pStyle w:val="BodyText"/>
         <w:rPr>
           <w:rFonts w:ascii="Times New Roman"/>
           <w:sz w:val="20"/>
@@ -5029,7 +4332,7 @@
     </w:p>
     <w:p>
       <w:pPr>
-        <w:pStyle w:val="a3"/>
+        <w:pStyle w:val="BodyText"/>
         <w:rPr>
           <w:rFonts w:ascii="Times New Roman"/>
           <w:sz w:val="20"/>
@@ -5053,7 +4356,7 @@
     </w:p>
     <w:p>
       <w:pPr>
-        <w:pStyle w:val="a3"/>
+        <w:pStyle w:val="BodyText"/>
         <w:spacing w:before="11"/>
         <w:rPr>
           <w:rFonts w:ascii="Times New Roman"/>
@@ -5120,7 +4423,7 @@
     </w:p>
     <w:p>
       <w:pPr>
-        <w:pStyle w:val="a3"/>
+        <w:pStyle w:val="BodyText"/>
         <w:spacing w:before="11"/>
         <w:rPr>
           <w:rFonts w:ascii="Times New Roman"/>
@@ -5216,7 +4519,7 @@
     </w:p>
     <w:p>
       <w:pPr>
-        <w:pStyle w:val="a3"/>
+        <w:pStyle w:val="BodyText"/>
         <w:spacing w:before="11"/>
         <w:rPr>
           <w:rFonts w:ascii="Times New Roman"/>
@@ -5298,7 +4601,7 @@
     </w:p>
     <w:p>
       <w:pPr>
-        <w:pStyle w:val="a3"/>
+        <w:pStyle w:val="BodyText"/>
         <w:spacing w:before="11"/>
         <w:rPr>
           <w:rFonts w:ascii="Times New Roman"/>
@@ -5394,7 +4697,7 @@
 </file>
 
 <file path=word/endnotes.xml><?xml version="1.0" encoding="utf-8"?>
-<w:endnotes xmlns:wpc="http://schemas.microsoft.com/office/word/2010/wordprocessingCanvas" xmlns:cx="http://schemas.microsoft.com/office/drawing/2014/chartex" xmlns:cx1="http://schemas.microsoft.com/office/drawing/2015/9/8/chartex" xmlns:cx2="http://schemas.microsoft.com/office/drawing/2015/10/21/chartex" xmlns:cx3="http://schemas.microsoft.com/office/drawing/2016/5/9/chartex" xmlns:cx4="http://schemas.microsoft.com/office/drawing/2016/5/10/chartex" xmlns:cx5="http://schemas.microsoft.com/office/drawing/2016/5/11/chartex" xmlns:cx6="http://schemas.microsoft.com/office/drawing/2016/5/12/chartex" xmlns:cx7="http://schemas.microsoft.com/office/drawing/2016/5/13/chartex" xmlns:cx8="http://schemas.microsoft.com/office/drawing/2016/5/14/chartex" xmlns:mc="http://schemas.openxmlformats.org/markup-compatibility/2006" xmlns:aink="http://schemas.microsoft.com/office/drawing/2016/ink" xmlns:am3d="http://schemas.microsoft.com/office/drawing/2017/model3d" xmlns:o="urn:schemas-microsoft-com:office:office" xmlns:oel="http://schemas.microsoft.com/office/2019/extlst" xmlns:r="http://schemas.openxmlformats.org/officeDocument/2006/relationships" xmlns:m="http://schemas.openxmlformats.org/officeDocument/2006/math" xmlns:v="urn:schemas-microsoft-com:vml" xmlns:wp14="http://schemas.microsoft.com/office/word/2010/wordprocessingDrawing" xmlns:wp="http://schemas.openxmlformats.org/drawingml/2006/wordprocessingDrawing" xmlns:w10="urn:schemas-microsoft-com:office:word" xmlns:w="http://schemas.openxmlformats.org/wordprocessingml/2006/main" xmlns:w14="http://schemas.microsoft.com/office/word/2010/wordml" xmlns:w15="http://schemas.microsoft.com/office/word/2012/wordml" xmlns:w16cex="http://schemas.microsoft.com/office/word/2018/wordml/cex" xmlns:w16cid="http://schemas.microsoft.com/office/word/2016/wordml/cid" xmlns:w16="http://schemas.microsoft.com/office/word/2018/wordml" xmlns:w16du="http://schemas.microsoft.com/office/word/2023/wordml/word16du" xmlns:w16sdtdh="http://schemas.microsoft.com/office/word/2020/wordml/sdtdatahash" xmlns:w16sdtfl="http://schemas.microsoft.com/office/word/2024/wordml/sdtformatlock" xmlns:w16se="http://schemas.microsoft.com/office/word/2015/wordml/symex" xmlns:wpg="http://schemas.microsoft.com/office/word/2010/wordprocessingGroup" xmlns:wpi="http://schemas.microsoft.com/office/word/2010/wordprocessingInk" xmlns:wne="http://schemas.microsoft.com/office/word/2006/wordml" xmlns:wps="http://schemas.microsoft.com/office/word/2010/wordprocessingShape" mc:Ignorable="w14 w15 w16se w16cid w16 w16cex w16sdtdh w16sdtfl w16du wp14">
+<w:endnotes xmlns:wpc="http://schemas.microsoft.com/office/word/2010/wordprocessingCanvas" xmlns:cx="http://schemas.microsoft.com/office/drawing/2014/chartex" xmlns:cx1="http://schemas.microsoft.com/office/drawing/2015/9/8/chartex" xmlns:cx2="http://schemas.microsoft.com/office/drawing/2015/10/21/chartex" xmlns:cx3="http://schemas.microsoft.com/office/drawing/2016/5/9/chartex" xmlns:cx4="http://schemas.microsoft.com/office/drawing/2016/5/10/chartex" xmlns:cx5="http://schemas.microsoft.com/office/drawing/2016/5/11/chartex" xmlns:cx6="http://schemas.microsoft.com/office/drawing/2016/5/12/chartex" xmlns:cx7="http://schemas.microsoft.com/office/drawing/2016/5/13/chartex" xmlns:cx8="http://schemas.microsoft.com/office/drawing/2016/5/14/chartex" xmlns:mc="http://schemas.openxmlformats.org/markup-compatibility/2006" xmlns:aink="http://schemas.microsoft.com/office/drawing/2016/ink" xmlns:am3d="http://schemas.microsoft.com/office/drawing/2017/model3d" xmlns:o="urn:schemas-microsoft-com:office:office" xmlns:oel="http://schemas.microsoft.com/office/2019/extlst" xmlns:r="http://schemas.openxmlformats.org/officeDocument/2006/relationships" xmlns:m="http://schemas.openxmlformats.org/officeDocument/2006/math" xmlns:v="urn:schemas-microsoft-com:vml" xmlns:wp14="http://schemas.microsoft.com/office/word/2010/wordprocessingDrawing" xmlns:wp="http://schemas.openxmlformats.org/drawingml/2006/wordprocessingDrawing" xmlns:w10="urn:schemas-microsoft-com:office:word" xmlns:w="http://schemas.openxmlformats.org/wordprocessingml/2006/main" xmlns:w14="http://schemas.microsoft.com/office/word/2010/wordml" xmlns:w15="http://schemas.microsoft.com/office/word/2012/wordml" xmlns:w16cex="http://schemas.microsoft.com/office/word/2018/wordml/cex" xmlns:w16cid="http://schemas.microsoft.com/office/word/2016/wordml/cid" xmlns:w16="http://schemas.microsoft.com/office/word/2018/wordml" xmlns:w16sdtdh="http://schemas.microsoft.com/office/word/2020/wordml/sdtdatahash" xmlns:w16se="http://schemas.microsoft.com/office/word/2015/wordml/symex" xmlns:wpg="http://schemas.microsoft.com/office/word/2010/wordprocessingGroup" xmlns:wpi="http://schemas.microsoft.com/office/word/2010/wordprocessingInk" xmlns:wne="http://schemas.microsoft.com/office/word/2006/wordml" xmlns:wps="http://schemas.microsoft.com/office/word/2010/wordprocessingShape" mc:Ignorable="w14 w15 w16se w16cid w16 w16cex w16sdtdh wp14">
   <w:endnote w:type="separator" w:id="-1">
     <w:p>
       <w:r>
@@ -5413,7 +4716,7 @@
 </file>
 
 <file path=word/footnotes.xml><?xml version="1.0" encoding="utf-8"?>
-<w:footnotes xmlns:wpc="http://schemas.microsoft.com/office/word/2010/wordprocessingCanvas" xmlns:cx="http://schemas.microsoft.com/office/drawing/2014/chartex" xmlns:cx1="http://schemas.microsoft.com/office/drawing/2015/9/8/chartex" xmlns:cx2="http://schemas.microsoft.com/office/drawing/2015/10/21/chartex" xmlns:cx3="http://schemas.microsoft.com/office/drawing/2016/5/9/chartex" xmlns:cx4="http://schemas.microsoft.com/office/drawing/2016/5/10/chartex" xmlns:cx5="http://schemas.microsoft.com/office/drawing/2016/5/11/chartex" xmlns:cx6="http://schemas.microsoft.com/office/drawing/2016/5/12/chartex" xmlns:cx7="http://schemas.microsoft.com/office/drawing/2016/5/13/chartex" xmlns:cx8="http://schemas.microsoft.com/office/drawing/2016/5/14/chartex" xmlns:mc="http://schemas.openxmlformats.org/markup-compatibility/2006" xmlns:aink="http://schemas.microsoft.com/office/drawing/2016/ink" xmlns:am3d="http://schemas.microsoft.com/office/drawing/2017/model3d" xmlns:o="urn:schemas-microsoft-com:office:office" xmlns:oel="http://schemas.microsoft.com/office/2019/extlst" xmlns:r="http://schemas.openxmlformats.org/officeDocument/2006/relationships" xmlns:m="http://schemas.openxmlformats.org/officeDocument/2006/math" xmlns:v="urn:schemas-microsoft-com:vml" xmlns:wp14="http://schemas.microsoft.com/office/word/2010/wordprocessingDrawing" xmlns:wp="http://schemas.openxmlformats.org/drawingml/2006/wordprocessingDrawing" xmlns:w10="urn:schemas-microsoft-com:office:word" xmlns:w="http://schemas.openxmlformats.org/wordprocessingml/2006/main" xmlns:w14="http://schemas.microsoft.com/office/word/2010/wordml" xmlns:w15="http://schemas.microsoft.com/office/word/2012/wordml" xmlns:w16cex="http://schemas.microsoft.com/office/word/2018/wordml/cex" xmlns:w16cid="http://schemas.microsoft.com/office/word/2016/wordml/cid" xmlns:w16="http://schemas.microsoft.com/office/word/2018/wordml" xmlns:w16du="http://schemas.microsoft.com/office/word/2023/wordml/word16du" xmlns:w16sdtdh="http://schemas.microsoft.com/office/word/2020/wordml/sdtdatahash" xmlns:w16sdtfl="http://schemas.microsoft.com/office/word/2024/wordml/sdtformatlock" xmlns:w16se="http://schemas.microsoft.com/office/word/2015/wordml/symex" xmlns:wpg="http://schemas.microsoft.com/office/word/2010/wordprocessingGroup" xmlns:wpi="http://schemas.microsoft.com/office/word/2010/wordprocessingInk" xmlns:wne="http://schemas.microsoft.com/office/word/2006/wordml" xmlns:wps="http://schemas.microsoft.com/office/word/2010/wordprocessingShape" mc:Ignorable="w14 w15 w16se w16cid w16 w16cex w16sdtdh w16sdtfl w16du wp14">
+<w:footnotes xmlns:wpc="http://schemas.microsoft.com/office/word/2010/wordprocessingCanvas" xmlns:cx="http://schemas.microsoft.com/office/drawing/2014/chartex" xmlns:cx1="http://schemas.microsoft.com/office/drawing/2015/9/8/chartex" xmlns:cx2="http://schemas.microsoft.com/office/drawing/2015/10/21/chartex" xmlns:cx3="http://schemas.microsoft.com/office/drawing/2016/5/9/chartex" xmlns:cx4="http://schemas.microsoft.com/office/drawing/2016/5/10/chartex" xmlns:cx5="http://schemas.microsoft.com/office/drawing/2016/5/11/chartex" xmlns:cx6="http://schemas.microsoft.com/office/drawing/2016/5/12/chartex" xmlns:cx7="http://schemas.microsoft.com/office/drawing/2016/5/13/chartex" xmlns:cx8="http://schemas.microsoft.com/office/drawing/2016/5/14/chartex" xmlns:mc="http://schemas.openxmlformats.org/markup-compatibility/2006" xmlns:aink="http://schemas.microsoft.com/office/drawing/2016/ink" xmlns:am3d="http://schemas.microsoft.com/office/drawing/2017/model3d" xmlns:o="urn:schemas-microsoft-com:office:office" xmlns:oel="http://schemas.microsoft.com/office/2019/extlst" xmlns:r="http://schemas.openxmlformats.org/officeDocument/2006/relationships" xmlns:m="http://schemas.openxmlformats.org/officeDocument/2006/math" xmlns:v="urn:schemas-microsoft-com:vml" xmlns:wp14="http://schemas.microsoft.com/office/word/2010/wordprocessingDrawing" xmlns:wp="http://schemas.openxmlformats.org/drawingml/2006/wordprocessingDrawing" xmlns:w10="urn:schemas-microsoft-com:office:word" xmlns:w="http://schemas.openxmlformats.org/wordprocessingml/2006/main" xmlns:w14="http://schemas.microsoft.com/office/word/2010/wordml" xmlns:w15="http://schemas.microsoft.com/office/word/2012/wordml" xmlns:w16cex="http://schemas.microsoft.com/office/word/2018/wordml/cex" xmlns:w16cid="http://schemas.microsoft.com/office/word/2016/wordml/cid" xmlns:w16="http://schemas.microsoft.com/office/word/2018/wordml" xmlns:w16sdtdh="http://schemas.microsoft.com/office/word/2020/wordml/sdtdatahash" xmlns:w16se="http://schemas.microsoft.com/office/word/2015/wordml/symex" xmlns:wpg="http://schemas.microsoft.com/office/word/2010/wordprocessingGroup" xmlns:wpi="http://schemas.microsoft.com/office/word/2010/wordprocessingInk" xmlns:wne="http://schemas.microsoft.com/office/word/2006/wordml" xmlns:wps="http://schemas.microsoft.com/office/word/2010/wordprocessingShape" mc:Ignorable="w14 w15 w16se w16cid w16 w16cex w16sdtdh wp14">
   <w:footnote w:type="separator" w:id="-1">
     <w:p>
       <w:r>
@@ -5432,7 +4735,7 @@
 </file>
 
 <file path=word/numbering.xml><?xml version="1.0" encoding="utf-8"?>
-<w:numbering xmlns:wpc="http://schemas.microsoft.com/office/word/2010/wordprocessingCanvas" xmlns:cx="http://schemas.microsoft.com/office/drawing/2014/chartex" xmlns:cx1="http://schemas.microsoft.com/office/drawing/2015/9/8/chartex" xmlns:cx2="http://schemas.microsoft.com/office/drawing/2015/10/21/chartex" xmlns:cx3="http://schemas.microsoft.com/office/drawing/2016/5/9/chartex" xmlns:cx4="http://schemas.microsoft.com/office/drawing/2016/5/10/chartex" xmlns:cx5="http://schemas.microsoft.com/office/drawing/2016/5/11/chartex" xmlns:cx6="http://schemas.microsoft.com/office/drawing/2016/5/12/chartex" xmlns:cx7="http://schemas.microsoft.com/office/drawing/2016/5/13/chartex" xmlns:cx8="http://schemas.microsoft.com/office/drawing/2016/5/14/chartex" xmlns:mc="http://schemas.openxmlformats.org/markup-compatibility/2006" xmlns:aink="http://schemas.microsoft.com/office/drawing/2016/ink" xmlns:am3d="http://schemas.microsoft.com/office/drawing/2017/model3d" xmlns:o="urn:schemas-microsoft-com:office:office" xmlns:oel="http://schemas.microsoft.com/office/2019/extlst" xmlns:r="http://schemas.openxmlformats.org/officeDocument/2006/relationships" xmlns:m="http://schemas.openxmlformats.org/officeDocument/2006/math" xmlns:v="urn:schemas-microsoft-com:vml" xmlns:wp14="http://schemas.microsoft.com/office/word/2010/wordprocessingDrawing" xmlns:wp="http://schemas.openxmlformats.org/drawingml/2006/wordprocessingDrawing" xmlns:w10="urn:schemas-microsoft-com:office:word" xmlns:w="http://schemas.openxmlformats.org/wordprocessingml/2006/main" xmlns:w14="http://schemas.microsoft.com/office/word/2010/wordml" xmlns:w15="http://schemas.microsoft.com/office/word/2012/wordml" xmlns:w16cex="http://schemas.microsoft.com/office/word/2018/wordml/cex" xmlns:w16cid="http://schemas.microsoft.com/office/word/2016/wordml/cid" xmlns:w16="http://schemas.microsoft.com/office/word/2018/wordml" xmlns:w16du="http://schemas.microsoft.com/office/word/2023/wordml/word16du" xmlns:w16sdtdh="http://schemas.microsoft.com/office/word/2020/wordml/sdtdatahash" xmlns:w16sdtfl="http://schemas.microsoft.com/office/word/2024/wordml/sdtformatlock" xmlns:w16se="http://schemas.microsoft.com/office/word/2015/wordml/symex" xmlns:wpg="http://schemas.microsoft.com/office/word/2010/wordprocessingGroup" xmlns:wpi="http://schemas.microsoft.com/office/word/2010/wordprocessingInk" xmlns:wne="http://schemas.microsoft.com/office/word/2006/wordml" xmlns:wps="http://schemas.microsoft.com/office/word/2010/wordprocessingShape" mc:Ignorable="w14 w15 w16se w16cid w16 w16cex w16sdtdh w16sdtfl w16du wp14">
+<w:numbering xmlns:wpc="http://schemas.microsoft.com/office/word/2010/wordprocessingCanvas" xmlns:cx="http://schemas.microsoft.com/office/drawing/2014/chartex" xmlns:cx1="http://schemas.microsoft.com/office/drawing/2015/9/8/chartex" xmlns:cx2="http://schemas.microsoft.com/office/drawing/2015/10/21/chartex" xmlns:cx3="http://schemas.microsoft.com/office/drawing/2016/5/9/chartex" xmlns:cx4="http://schemas.microsoft.com/office/drawing/2016/5/10/chartex" xmlns:cx5="http://schemas.microsoft.com/office/drawing/2016/5/11/chartex" xmlns:cx6="http://schemas.microsoft.com/office/drawing/2016/5/12/chartex" xmlns:cx7="http://schemas.microsoft.com/office/drawing/2016/5/13/chartex" xmlns:cx8="http://schemas.microsoft.com/office/drawing/2016/5/14/chartex" xmlns:mc="http://schemas.openxmlformats.org/markup-compatibility/2006" xmlns:aink="http://schemas.microsoft.com/office/drawing/2016/ink" xmlns:am3d="http://schemas.microsoft.com/office/drawing/2017/model3d" xmlns:o="urn:schemas-microsoft-com:office:office" xmlns:oel="http://schemas.microsoft.com/office/2019/extlst" xmlns:r="http://schemas.openxmlformats.org/officeDocument/2006/relationships" xmlns:m="http://schemas.openxmlformats.org/officeDocument/2006/math" xmlns:v="urn:schemas-microsoft-com:vml" xmlns:wp14="http://schemas.microsoft.com/office/word/2010/wordprocessingDrawing" xmlns:wp="http://schemas.openxmlformats.org/drawingml/2006/wordprocessingDrawing" xmlns:w10="urn:schemas-microsoft-com:office:word" xmlns:w="http://schemas.openxmlformats.org/wordprocessingml/2006/main" xmlns:w14="http://schemas.microsoft.com/office/word/2010/wordml" xmlns:w15="http://schemas.microsoft.com/office/word/2012/wordml" xmlns:w16cex="http://schemas.microsoft.com/office/word/2018/wordml/cex" xmlns:w16cid="http://schemas.microsoft.com/office/word/2016/wordml/cid" xmlns:w16="http://schemas.microsoft.com/office/word/2018/wordml" xmlns:w16sdtdh="http://schemas.microsoft.com/office/word/2020/wordml/sdtdatahash" xmlns:w16se="http://schemas.microsoft.com/office/word/2015/wordml/symex" xmlns:wpg="http://schemas.microsoft.com/office/word/2010/wordprocessingGroup" xmlns:wpi="http://schemas.microsoft.com/office/word/2010/wordprocessingInk" xmlns:wne="http://schemas.microsoft.com/office/word/2006/wordml" xmlns:wps="http://schemas.microsoft.com/office/word/2010/wordprocessingShape" mc:Ignorable="w14 w15 w16se w16cid w16 w16cex w16sdtdh wp14">
   <w:abstractNum w:abstractNumId="0" w15:restartNumberingAfterBreak="0">
     <w:nsid w:val="12D9309D"/>
     <w:multiLevelType w:val="hybridMultilevel"/>
@@ -6040,7 +5343,7 @@
 </file>
 
 <file path=word/styles.xml><?xml version="1.0" encoding="utf-8"?>
-<w:styles xmlns:mc="http://schemas.openxmlformats.org/markup-compatibility/2006" xmlns:r="http://schemas.openxmlformats.org/officeDocument/2006/relationships" xmlns:w="http://schemas.openxmlformats.org/wordprocessingml/2006/main" xmlns:w14="http://schemas.microsoft.com/office/word/2010/wordml" xmlns:w15="http://schemas.microsoft.com/office/word/2012/wordml" xmlns:w16cex="http://schemas.microsoft.com/office/word/2018/wordml/cex" xmlns:w16cid="http://schemas.microsoft.com/office/word/2016/wordml/cid" xmlns:w16="http://schemas.microsoft.com/office/word/2018/wordml" xmlns:w16du="http://schemas.microsoft.com/office/word/2023/wordml/word16du" xmlns:w16sdtdh="http://schemas.microsoft.com/office/word/2020/wordml/sdtdatahash" xmlns:w16sdtfl="http://schemas.microsoft.com/office/word/2024/wordml/sdtformatlock" xmlns:w16se="http://schemas.microsoft.com/office/word/2015/wordml/symex" mc:Ignorable="w14 w15 w16se w16cid w16 w16cex w16sdtdh w16sdtfl w16du">
+<w:styles xmlns:mc="http://schemas.openxmlformats.org/markup-compatibility/2006" xmlns:r="http://schemas.openxmlformats.org/officeDocument/2006/relationships" xmlns:w="http://schemas.openxmlformats.org/wordprocessingml/2006/main" xmlns:w14="http://schemas.microsoft.com/office/word/2010/wordml" xmlns:w15="http://schemas.microsoft.com/office/word/2012/wordml" xmlns:w16cex="http://schemas.microsoft.com/office/word/2018/wordml/cex" xmlns:w16cid="http://schemas.microsoft.com/office/word/2016/wordml/cid" xmlns:w16="http://schemas.microsoft.com/office/word/2018/wordml" xmlns:w16sdtdh="http://schemas.microsoft.com/office/word/2020/wordml/sdtdatahash" xmlns:w16se="http://schemas.microsoft.com/office/word/2015/wordml/symex" mc:Ignorable="w14 w15 w16se w16cid w16 w16cex w16sdtdh">
   <w:docDefaults>
     <w:rPrDefault>
       <w:rPr>
@@ -6436,7 +5739,7 @@
     <w:lsdException w:name="Unresolved Mention" w:semiHidden="1" w:unhideWhenUsed="1"/>
     <w:lsdException w:name="Smart Link" w:semiHidden="1" w:unhideWhenUsed="1"/>
   </w:latentStyles>
-  <w:style w:type="paragraph" w:default="1" w:styleId="a">
+  <w:style w:type="paragraph" w:default="1" w:styleId="Normal">
     <w:name w:val="Normal"/>
     <w:qFormat/>
     <w:rPr>
@@ -6444,13 +5747,13 @@
       <w:lang w:val="zh-TW" w:eastAsia="zh-TW" w:bidi="zh-TW"/>
     </w:rPr>
   </w:style>
-  <w:style w:type="character" w:default="1" w:styleId="a0">
+  <w:style w:type="character" w:default="1" w:styleId="DefaultParagraphFont">
     <w:name w:val="Default Paragraph Font"/>
     <w:uiPriority w:val="1"/>
     <w:semiHidden/>
     <w:unhideWhenUsed/>
   </w:style>
-  <w:style w:type="table" w:default="1" w:styleId="a1">
+  <w:style w:type="table" w:default="1" w:styleId="TableNormal">
     <w:name w:val="Normal Table"/>
     <w:uiPriority w:val="99"/>
     <w:semiHidden/>
@@ -6465,14 +5768,14 @@
       </w:tblCellMar>
     </w:tblPr>
   </w:style>
-  <w:style w:type="numbering" w:default="1" w:styleId="a2">
+  <w:style w:type="numbering" w:default="1" w:styleId="NoList">
     <w:name w:val="No List"/>
     <w:uiPriority w:val="99"/>
     <w:semiHidden/>
     <w:unhideWhenUsed/>
   </w:style>
-  <w:style w:type="table" w:customStyle="1" w:styleId="TableNormal">
-    <w:name w:val="Table Normal"/>
+  <w:style w:type="table" w:customStyle="1" w:styleId="TableNormal1">
+    <w:name w:val="Table Normal1"/>
     <w:uiPriority w:val="2"/>
     <w:semiHidden/>
     <w:unhideWhenUsed/>
@@ -6487,9 +5790,9 @@
       </w:tblCellMar>
     </w:tblPr>
   </w:style>
-  <w:style w:type="paragraph" w:styleId="a3">
+  <w:style w:type="paragraph" w:styleId="BodyText">
     <w:name w:val="Body Text"/>
-    <w:basedOn w:val="a"/>
+    <w:basedOn w:val="Normal"/>
     <w:uiPriority w:val="1"/>
     <w:qFormat/>
     <w:rPr>
@@ -6497,9 +5800,9 @@
       <w:szCs w:val="24"/>
     </w:rPr>
   </w:style>
-  <w:style w:type="paragraph" w:styleId="a4">
+  <w:style w:type="paragraph" w:styleId="ListParagraph">
     <w:name w:val="List Paragraph"/>
-    <w:basedOn w:val="a"/>
+    <w:basedOn w:val="Normal"/>
     <w:uiPriority w:val="1"/>
     <w:qFormat/>
     <w:pPr>
@@ -6509,14 +5812,14 @@
   </w:style>
   <w:style w:type="paragraph" w:customStyle="1" w:styleId="TableParagraph">
     <w:name w:val="Table Paragraph"/>
-    <w:basedOn w:val="a"/>
+    <w:basedOn w:val="Normal"/>
     <w:uiPriority w:val="1"/>
     <w:qFormat/>
   </w:style>
-  <w:style w:type="paragraph" w:styleId="a5">
+  <w:style w:type="paragraph" w:styleId="Header">
     <w:name w:val="header"/>
-    <w:basedOn w:val="a"/>
-    <w:link w:val="a6"/>
+    <w:basedOn w:val="Normal"/>
+    <w:link w:val="HeaderChar"/>
     <w:uiPriority w:val="99"/>
     <w:unhideWhenUsed/>
     <w:rsid w:val="00940782"/>
@@ -6537,10 +5840,10 @@
       <w:lang w:val="en-US" w:bidi="ar-SA"/>
     </w:rPr>
   </w:style>
-  <w:style w:type="character" w:customStyle="1" w:styleId="a6">
-    <w:name w:val="頁首 字元"/>
-    <w:basedOn w:val="a0"/>
-    <w:link w:val="a5"/>
+  <w:style w:type="character" w:customStyle="1" w:styleId="HeaderChar">
+    <w:name w:val="Header Char"/>
+    <w:basedOn w:val="DefaultParagraphFont"/>
+    <w:link w:val="Header"/>
     <w:uiPriority w:val="99"/>
     <w:rsid w:val="00940782"/>
     <w:rPr>
@@ -6550,10 +5853,10 @@
       <w:lang w:eastAsia="zh-TW"/>
     </w:rPr>
   </w:style>
-  <w:style w:type="paragraph" w:styleId="a7">
+  <w:style w:type="paragraph" w:styleId="Footer">
     <w:name w:val="footer"/>
-    <w:basedOn w:val="a"/>
-    <w:link w:val="a8"/>
+    <w:basedOn w:val="Normal"/>
+    <w:link w:val="FooterChar"/>
     <w:uiPriority w:val="99"/>
     <w:unhideWhenUsed/>
     <w:rsid w:val="00A11860"/>
@@ -6569,10 +5872,10 @@
       <w:szCs w:val="20"/>
     </w:rPr>
   </w:style>
-  <w:style w:type="character" w:customStyle="1" w:styleId="a8">
-    <w:name w:val="頁尾 字元"/>
-    <w:basedOn w:val="a0"/>
-    <w:link w:val="a7"/>
+  <w:style w:type="character" w:customStyle="1" w:styleId="FooterChar">
+    <w:name w:val="Footer Char"/>
+    <w:basedOn w:val="DefaultParagraphFont"/>
+    <w:link w:val="Footer"/>
     <w:uiPriority w:val="99"/>
     <w:rsid w:val="00A11860"/>
     <w:rPr>

</xml_diff>